<commit_message>
feat: Add results section layout with petal and pillar charts for DRM assessment, along with supporting scripts and documentation.
</commit_message>
<xml_diff>
--- a/assets/documents/DRM Policy Tool - Methodological Note.docx
+++ b/assets/documents/DRM Policy Tool - Methodological Note.docx
@@ -1786,7 +1786,11 @@
     </w:p>
     <w:p>
       <w:pPr>
-        <w:spacing w:before="120" w:after="120"/>
+        <w:pStyle w:val="Normal"/>
+        <w:suppressLineNumbers w:val="0"/>
+        <w:bidi w:val="0"/>
+        <w:spacing w:before="120" w:beforeAutospacing="off" w:after="120" w:afterAutospacing="off" w:line="259" w:lineRule="auto"/>
+        <w:ind w:left="0" w:right="0"/>
         <w:jc w:val="both"/>
         <w:rPr>
           <w:rFonts w:ascii="Aptos" w:hAnsi="Aptos" w:eastAsia="Aptos" w:cs="Aptos"/>
@@ -1795,24 +1799,24 @@
       <w:r>
         <w:rPr>
           <w:rFonts w:ascii="Aptos" w:hAnsi="Aptos" w:eastAsia="Aptos" w:cs="Aptos"/>
-          <w:b/>
-          <w:bCs/>
+          <w:b w:val="1"/>
+          <w:bCs w:val="1"/>
         </w:rPr>
         <w:t xml:space="preserve">The </w:t>
       </w:r>
       <w:r>
         <w:rPr>
           <w:rFonts w:ascii="Aptos" w:hAnsi="Aptos" w:eastAsia="Aptos" w:cs="Aptos"/>
-          <w:b/>
-          <w:bCs/>
+          <w:b w:val="1"/>
+          <w:bCs w:val="1"/>
         </w:rPr>
         <w:t>maturity</w:t>
       </w:r>
       <w:r>
         <w:rPr>
           <w:rFonts w:ascii="Aptos" w:hAnsi="Aptos" w:eastAsia="Aptos" w:cs="Aptos"/>
-          <w:b/>
-          <w:bCs/>
+          <w:b w:val="1"/>
+          <w:bCs w:val="1"/>
         </w:rPr>
         <w:t xml:space="preserve"> of each thematic area and pillar is defined as the distance to the DRM policy frontier.</w:t>
       </w:r>
@@ -1820,12 +1824,24 @@
         <w:rPr>
           <w:rFonts w:ascii="Aptos" w:hAnsi="Aptos" w:eastAsia="Aptos" w:cs="Aptos"/>
         </w:rPr>
-        <w:t xml:space="preserve"> Responses are aggregated to produce a score, which is then compared to the maximum possible score </w:t>
+        <w:t xml:space="preserve"> Responses are aggregated to produce a score, which is then compared to the </w:t>
       </w:r>
       <w:r>
         <w:rPr>
           <w:rFonts w:ascii="Aptos" w:hAnsi="Aptos" w:eastAsia="Aptos" w:cs="Aptos"/>
         </w:rPr>
+        <w:t>maximum</w:t>
+      </w:r>
+      <w:r>
+        <w:rPr>
+          <w:rFonts w:ascii="Aptos" w:hAnsi="Aptos" w:eastAsia="Aptos" w:cs="Aptos"/>
+        </w:rPr>
+        <w:t xml:space="preserve"> possible score </w:t>
+      </w:r>
+      <w:r>
+        <w:rPr>
+          <w:rFonts w:ascii="Aptos" w:hAnsi="Aptos" w:eastAsia="Aptos" w:cs="Aptos"/>
+        </w:rPr>
         <w:t xml:space="preserve">under each thematic area </w:t>
       </w:r>
       <w:r>
@@ -1916,13 +1932,31 @@
         <w:rPr>
           <w:rFonts w:ascii="Aptos" w:hAnsi="Aptos" w:eastAsia="Aptos" w:cs="Aptos"/>
         </w:rPr>
-        <w:t xml:space="preserve"> classified into four maturity levels—Nascent, Emerging, Established, and Mature</w:t>
+        <w:t xml:space="preserve"> classified into four maturity levels—Nascent, Emerging, </w:t>
       </w:r>
       <w:r>
         <w:rPr>
           <w:rFonts w:ascii="Aptos" w:hAnsi="Aptos" w:eastAsia="Aptos" w:cs="Aptos"/>
         </w:rPr>
-        <w:t xml:space="preserve"> (figure </w:t>
+        <w:t>Established</w:t>
+      </w:r>
+      <w:r>
+        <w:rPr>
+          <w:rFonts w:ascii="Aptos" w:hAnsi="Aptos" w:eastAsia="Aptos" w:cs="Aptos"/>
+        </w:rPr>
+        <w:t xml:space="preserve">, and </w:t>
+      </w:r>
+      <w:r>
+        <w:rPr>
+          <w:rFonts w:ascii="Aptos" w:hAnsi="Aptos" w:eastAsia="Aptos" w:cs="Aptos"/>
+        </w:rPr>
+        <w:t xml:space="preserve">Advanced </w:t>
+      </w:r>
+      <w:r>
+        <w:rPr>
+          <w:rFonts w:ascii="Aptos" w:hAnsi="Aptos" w:eastAsia="Aptos" w:cs="Aptos"/>
+        </w:rPr>
+        <w:t xml:space="preserve">(figure </w:t>
       </w:r>
       <w:r>
         <w:rPr>
@@ -1951,24 +1985,24 @@
       <w:r>
         <w:rPr>
           <w:rFonts w:ascii="Aptos" w:hAnsi="Aptos" w:eastAsia="Aptos" w:cs="Aptos"/>
-          <w:b/>
-          <w:bCs/>
+          <w:b w:val="1"/>
+          <w:bCs w:val="1"/>
         </w:rPr>
         <w:t xml:space="preserve">Figure </w:t>
       </w:r>
       <w:r>
         <w:rPr>
           <w:rFonts w:ascii="Aptos" w:hAnsi="Aptos" w:eastAsia="Aptos" w:cs="Aptos"/>
-          <w:b/>
-          <w:bCs/>
+          <w:b w:val="1"/>
+          <w:bCs w:val="1"/>
         </w:rPr>
         <w:t>2</w:t>
       </w:r>
       <w:r>
         <w:rPr>
           <w:rFonts w:ascii="Aptos" w:hAnsi="Aptos" w:eastAsia="Aptos" w:cs="Aptos"/>
-          <w:b/>
-          <w:bCs/>
+          <w:b w:val="1"/>
+          <w:bCs w:val="1"/>
         </w:rPr>
         <w:t xml:space="preserve">. </w:t>
       </w:r>
@@ -1979,6 +2013,7 @@
         <w:t xml:space="preserve">The maturity levels associated with </w:t>
       </w:r>
       <w:r>
+        <w:rPr/>
         <w:t>different</w:t>
       </w:r>
       <w:r>
@@ -1987,11 +2022,10 @@
         </w:rPr>
         <w:t xml:space="preserve"> </w:t>
       </w:r>
-      <w:proofErr w:type="gramStart"/>
-      <w:r>
+      <w:r>
+        <w:rPr/>
         <w:t>share</w:t>
       </w:r>
-      <w:proofErr w:type="gramEnd"/>
       <w:r>
         <w:rPr>
           <w:rFonts w:ascii="Aptos" w:hAnsi="Aptos" w:eastAsia="Aptos" w:cs="Aptos"/>
@@ -2001,37 +2035,34 @@
     </w:p>
     <w:p>
       <w:pPr>
-        <w:spacing w:before="120" w:after="0"/>
+        <w:pStyle w:val="Normal"/>
+        <w:spacing w:after="80"/>
         <w:jc w:val="center"/>
       </w:pPr>
       <w:r>
-        <w:rPr>
-          <w:noProof/>
-        </w:rPr>
         <w:drawing>
-          <wp:inline distT="0" distB="0" distL="0" distR="0" wp14:anchorId="5E2BE38A" wp14:editId="57AE3068">
-            <wp:extent cx="5724525" cy="819159"/>
+          <wp:inline wp14:editId="50E4692A" wp14:anchorId="319A73DA">
+            <wp:extent cx="5724525" cy="1009650"/>
             <wp:effectExtent l="0" t="0" r="0" b="0"/>
-            <wp:docPr id="1021353795" name="drawing"/>
+            <wp:docPr id="271582621" name="drawing"/>
             <wp:cNvGraphicFramePr>
-              <a:graphicFrameLocks xmlns:a="http://schemas.openxmlformats.org/drawingml/2006/main" noChangeAspect="1"/>
+              <a:graphicFrameLocks noChangeAspect="1"/>
             </wp:cNvGraphicFramePr>
-            <a:graphic xmlns:a="http://schemas.openxmlformats.org/drawingml/2006/main">
-              <a:graphicData uri="http://schemas.openxmlformats.org/drawingml/2006/picture">
+            <a:graphic>
+              <a:graphicData xmlns:a="http://schemas.openxmlformats.org/drawingml/2006/main" uri="http://schemas.openxmlformats.org/drawingml/2006/picture">
                 <pic:pic xmlns:pic="http://schemas.openxmlformats.org/drawingml/2006/picture">
                   <pic:nvPicPr>
-                    <pic:cNvPr id="1021353795" name="Picture 1021353795"/>
+                    <pic:cNvPr id="271582621" name="Picture 271582621"/>
                     <pic:cNvPicPr/>
                   </pic:nvPicPr>
                   <pic:blipFill>
-                    <a:blip r:embed="rId11">
+                    <a:blip xmlns:r="http://schemas.openxmlformats.org/officeDocument/2006/relationships" r:embed="rId1297907332">
                       <a:extLst>
                         <a:ext uri="{28A0092B-C50C-407E-A947-70E740481C1C}">
                           <a14:useLocalDpi xmlns:a14="http://schemas.microsoft.com/office/drawing/2010/main"/>
                         </a:ext>
                       </a:extLst>
                     </a:blip>
-                    <a:srcRect t="18867"/>
                     <a:stretch>
                       <a:fillRect/>
                     </a:stretch>
@@ -2039,7 +2070,7 @@
                   <pic:spPr>
                     <a:xfrm>
                       <a:off x="0" y="0"/>
-                      <a:ext cx="5724525" cy="819159"/>
+                      <a:ext cx="5724525" cy="1009650"/>
                     </a:xfrm>
                     <a:prstGeom prst="rect">
                       <a:avLst/>
@@ -2470,26 +2501,27 @@
       </w:pPr>
       <w:r>
         <w:rPr>
-          <w:b/>
-          <w:bCs/>
+          <w:b w:val="1"/>
+          <w:bCs w:val="1"/>
         </w:rPr>
         <w:t xml:space="preserve">Figure </w:t>
       </w:r>
       <w:r>
         <w:rPr>
-          <w:b/>
-          <w:bCs/>
+          <w:b w:val="1"/>
+          <w:bCs w:val="1"/>
         </w:rPr>
         <w:t>3</w:t>
       </w:r>
       <w:r>
         <w:rPr>
-          <w:b/>
-          <w:bCs/>
+          <w:b w:val="1"/>
+          <w:bCs w:val="1"/>
         </w:rPr>
         <w:t>.</w:t>
       </w:r>
       <w:r>
+        <w:rPr/>
         <w:t xml:space="preserve"> </w:t>
       </w:r>
       <w:r>
@@ -2573,57 +2605,46 @@
     </w:p>
     <w:p>
       <w:pPr>
+        <w:pStyle w:val="Normal"/>
         <w:spacing w:after="0"/>
         <w:jc w:val="center"/>
       </w:pPr>
       <w:r>
-        <w:rPr>
-          <w:noProof/>
-        </w:rPr>
         <w:drawing>
-          <wp:inline distT="0" distB="0" distL="0" distR="0" wp14:anchorId="2613D149" wp14:editId="6E773962">
-            <wp:extent cx="5724525" cy="4298950"/>
-            <wp:effectExtent l="0" t="0" r="9525" b="6350"/>
-            <wp:docPr id="1632480675" name="drawing"/>
+          <wp:inline wp14:editId="277C34AA" wp14:anchorId="2F2E0806">
+            <wp:extent cx="4930694" cy="4200525"/>
+            <wp:effectExtent l="0" t="0" r="0" b="0"/>
+            <wp:docPr id="1711642642" name="drawing"/>
             <wp:cNvGraphicFramePr>
-              <a:graphicFrameLocks xmlns:a="http://schemas.openxmlformats.org/drawingml/2006/main" noChangeAspect="1"/>
+              <a:graphicFrameLocks noChangeAspect="1"/>
             </wp:cNvGraphicFramePr>
-            <a:graphic xmlns:a="http://schemas.openxmlformats.org/drawingml/2006/main">
-              <a:graphicData uri="http://schemas.openxmlformats.org/drawingml/2006/picture">
+            <a:graphic>
+              <a:graphicData xmlns:a="http://schemas.openxmlformats.org/drawingml/2006/main" uri="http://schemas.openxmlformats.org/drawingml/2006/picture">
                 <pic:pic xmlns:pic="http://schemas.openxmlformats.org/drawingml/2006/picture">
                   <pic:nvPicPr>
-                    <pic:cNvPr id="1632480675" name="Picture 1632480675"/>
+                    <pic:cNvPr id="1711642642" name="Picture 1711642642"/>
                     <pic:cNvPicPr/>
                   </pic:nvPicPr>
-                  <pic:blipFill rotWithShape="1">
-                    <a:blip r:embed="rId12">
+                  <pic:blipFill>
+                    <a:blip xmlns:r="http://schemas.openxmlformats.org/officeDocument/2006/relationships" r:embed="rId167149575">
                       <a:extLst>
                         <a:ext uri="{28A0092B-C50C-407E-A947-70E740481C1C}">
                           <a14:useLocalDpi xmlns:a14="http://schemas.microsoft.com/office/drawing/2010/main"/>
                         </a:ext>
                       </a:extLst>
                     </a:blip>
-                    <a:srcRect b="2519"/>
                     <a:stretch>
                       <a:fillRect/>
                     </a:stretch>
                   </pic:blipFill>
-                  <pic:spPr bwMode="auto">
-                    <a:xfrm>
+                  <pic:spPr>
+                    <a:xfrm rot="0">
                       <a:off x="0" y="0"/>
-                      <a:ext cx="5724525" cy="4298950"/>
+                      <a:ext cx="4930694" cy="4200525"/>
                     </a:xfrm>
                     <a:prstGeom prst="rect">
                       <a:avLst/>
                     </a:prstGeom>
-                    <a:ln>
-                      <a:noFill/>
-                    </a:ln>
-                    <a:extLst>
-                      <a:ext uri="{53640926-AAD7-44D8-BBD7-CCE9431645EC}">
-                        <a14:shadowObscured xmlns:a14="http://schemas.microsoft.com/office/drawing/2010/main"/>
-                      </a:ext>
-                    </a:extLst>
                   </pic:spPr>
                 </pic:pic>
               </a:graphicData>
@@ -2736,96 +2757,84 @@
       </w:pPr>
       <w:r>
         <w:rPr>
-          <w:b/>
-          <w:bCs/>
+          <w:b w:val="1"/>
+          <w:bCs w:val="1"/>
         </w:rPr>
         <w:t xml:space="preserve">Figure </w:t>
       </w:r>
       <w:r>
         <w:rPr>
-          <w:b/>
-          <w:bCs/>
+          <w:b w:val="1"/>
+          <w:bCs w:val="1"/>
         </w:rPr>
         <w:t>4</w:t>
       </w:r>
       <w:r>
         <w:rPr>
-          <w:b/>
-          <w:bCs/>
+          <w:b w:val="1"/>
+          <w:bCs w:val="1"/>
         </w:rPr>
         <w:t xml:space="preserve">. </w:t>
       </w:r>
       <w:r>
+        <w:rPr/>
         <w:t xml:space="preserve">Illustrative </w:t>
       </w:r>
-      <w:proofErr w:type="gramStart"/>
-      <w:r>
+      <w:r>
+        <w:rPr/>
         <w:t>example</w:t>
       </w:r>
-      <w:proofErr w:type="gramEnd"/>
-      <w:r>
+      <w:r>
+        <w:rPr/>
         <w:t xml:space="preserve"> of r</w:t>
       </w:r>
       <w:r>
+        <w:rPr/>
         <w:t xml:space="preserve">esults by DRM Pillar </w:t>
       </w:r>
     </w:p>
     <w:p>
       <w:pPr>
-        <w:spacing w:before="120" w:after="120" w:line="276" w:lineRule="auto"/>
+        <w:pStyle w:val="Normal"/>
+        <w:spacing w:after="80"/>
         <w:jc w:val="center"/>
       </w:pPr>
       <w:r>
-        <w:rPr>
-          <w:noProof/>
-        </w:rPr>
         <w:drawing>
-          <wp:inline distT="0" distB="0" distL="0" distR="0" wp14:anchorId="6AC85510" wp14:editId="7E47892D">
-            <wp:extent cx="4724400" cy="1939637"/>
-            <wp:effectExtent l="0" t="0" r="0" b="3810"/>
-            <wp:docPr id="1790614714" name="Picture 5"/>
+          <wp:inline wp14:editId="6DC07802" wp14:anchorId="357BE12B">
+            <wp:extent cx="5172075" cy="2203080"/>
+            <wp:effectExtent l="0" t="0" r="0" b="0"/>
+            <wp:docPr id="815859948" name="drawing"/>
             <wp:cNvGraphicFramePr>
-              <a:graphicFrameLocks xmlns:a="http://schemas.openxmlformats.org/drawingml/2006/main" noChangeAspect="1"/>
+              <a:graphicFrameLocks noChangeAspect="1"/>
             </wp:cNvGraphicFramePr>
-            <a:graphic xmlns:a="http://schemas.openxmlformats.org/drawingml/2006/main">
-              <a:graphicData uri="http://schemas.openxmlformats.org/drawingml/2006/picture">
+            <a:graphic>
+              <a:graphicData xmlns:a="http://schemas.openxmlformats.org/drawingml/2006/main" uri="http://schemas.openxmlformats.org/drawingml/2006/picture">
                 <pic:pic xmlns:pic="http://schemas.openxmlformats.org/drawingml/2006/picture">
                   <pic:nvPicPr>
-                    <pic:cNvPr id="0" name="Picture 6"/>
-                    <pic:cNvPicPr>
-                      <a:picLocks noChangeAspect="1" noChangeArrowheads="1"/>
-                    </pic:cNvPicPr>
+                    <pic:cNvPr id="815859948" name="Picture 815859948"/>
+                    <pic:cNvPicPr/>
                   </pic:nvPicPr>
-                  <pic:blipFill rotWithShape="1">
-                    <a:blip r:embed="rId13" cstate="print">
+                  <pic:blipFill>
+                    <a:blip xmlns:r="http://schemas.openxmlformats.org/officeDocument/2006/relationships" r:embed="rId801581607">
                       <a:extLst>
                         <a:ext uri="{28A0092B-C50C-407E-A947-70E740481C1C}">
-                          <a14:useLocalDpi xmlns:a14="http://schemas.microsoft.com/office/drawing/2010/main" val="0"/>
+                          <a14:useLocalDpi xmlns:a14="http://schemas.microsoft.com/office/drawing/2010/main"/>
                         </a:ext>
                       </a:extLst>
                     </a:blip>
-                    <a:srcRect l="3546" t="4506" r="14026" b="3739"/>
                     <a:stretch>
                       <a:fillRect/>
                     </a:stretch>
                   </pic:blipFill>
-                  <pic:spPr bwMode="auto">
-                    <a:xfrm>
+                  <pic:spPr>
+                    <a:xfrm rot="0">
                       <a:off x="0" y="0"/>
-                      <a:ext cx="4724400" cy="1939637"/>
+                      <a:ext cx="5172075" cy="2203080"/>
                     </a:xfrm>
                     <a:prstGeom prst="rect">
                       <a:avLst/>
                     </a:prstGeom>
-                    <a:noFill/>
-                    <a:ln>
-                      <a:noFill/>
-                    </a:ln>
-                    <a:extLst>
-                      <a:ext uri="{53640926-AAD7-44D8-BBD7-CCE9431645EC}">
-                        <a14:shadowObscured xmlns:a14="http://schemas.microsoft.com/office/drawing/2010/main"/>
-                      </a:ext>
-                    </a:extLst>
                   </pic:spPr>
                 </pic:pic>
               </a:graphicData>

</xml_diff>

<commit_message>
feat: modularize dashboard layout and incorporate project documentation and LLM narrative data.
</commit_message>
<xml_diff>
--- a/assets/documents/DRM Policy Tool - Methodological Note.docx
+++ b/assets/documents/DRM Policy Tool - Methodological Note.docx
@@ -5,57 +5,86 @@
     <w:p>
       <w:pPr>
         <w:pStyle w:val="Title"/>
-        <w:rPr>
-          <w:b/>
-          <w:bCs/>
+        <w:suppressLineNumbers w:val="0"/>
+        <w:bidi w:val="0"/>
+        <w:spacing w:before="0" w:beforeAutospacing="off" w:after="80" w:afterAutospacing="off" w:line="240" w:lineRule="auto"/>
+        <w:ind w:left="0" w:right="0"/>
+        <w:jc w:val="left"/>
+      </w:pPr>
+      <w:r>
+        <w:rPr>
+          <w:b w:val="1"/>
+          <w:bCs w:val="1"/>
           <w:sz w:val="48"/>
           <w:szCs w:val="48"/>
         </w:rPr>
-      </w:pPr>
-      <w:r>
-        <w:rPr>
-          <w:b/>
-          <w:bCs/>
+        <w:t xml:space="preserve">Evaluating </w:t>
+      </w:r>
+      <w:r>
+        <w:rPr>
+          <w:b w:val="1"/>
+          <w:bCs w:val="1"/>
           <w:sz w:val="48"/>
           <w:szCs w:val="48"/>
         </w:rPr>
-        <w:t xml:space="preserve">Evaluating </w:t>
-      </w:r>
-      <w:r>
-        <w:rPr>
-          <w:b/>
-          <w:bCs/>
+        <w:t>D</w:t>
+      </w:r>
+      <w:r>
+        <w:rPr>
+          <w:b w:val="1"/>
+          <w:bCs w:val="1"/>
           <w:sz w:val="48"/>
           <w:szCs w:val="48"/>
         </w:rPr>
-        <w:t xml:space="preserve">Disaster Risk Management </w:t>
-      </w:r>
-      <w:r>
-        <w:rPr>
-          <w:b/>
-          <w:bCs/>
+        <w:t>RM</w:t>
+      </w:r>
+      <w:r>
+        <w:rPr>
+          <w:b w:val="1"/>
+          <w:bCs w:val="1"/>
           <w:sz w:val="48"/>
           <w:szCs w:val="48"/>
         </w:rPr>
-        <w:t>Policy Frameworks: A</w:t>
-      </w:r>
-      <w:r>
-        <w:rPr>
-          <w:b/>
-          <w:bCs/>
+        <w:t xml:space="preserve"> </w:t>
+      </w:r>
+      <w:r>
+        <w:rPr>
+          <w:b w:val="1"/>
+          <w:bCs w:val="1"/>
           <w:sz w:val="48"/>
           <w:szCs w:val="48"/>
         </w:rPr>
-        <w:t xml:space="preserve"> Rapid Screening </w:t>
-      </w:r>
-      <w:r>
-        <w:rPr>
-          <w:b/>
-          <w:bCs/>
+        <w:t>Policy Frameworks</w:t>
+      </w:r>
+      <w:r>
+        <w:rPr>
+          <w:b w:val="1"/>
+          <w:bCs w:val="1"/>
           <w:sz w:val="48"/>
           <w:szCs w:val="48"/>
         </w:rPr>
-        <w:t>Tool</w:t>
+        <w:t>:</w:t>
+      </w:r>
+      <w:r>
+        <w:br/>
+      </w:r>
+      <w:r>
+        <w:rPr>
+          <w:b w:val="1"/>
+          <w:bCs w:val="1"/>
+          <w:sz w:val="48"/>
+          <w:szCs w:val="48"/>
+        </w:rPr>
+        <w:t xml:space="preserve">A </w:t>
+      </w:r>
+      <w:r>
+        <w:rPr>
+          <w:b w:val="1"/>
+          <w:bCs w:val="1"/>
+          <w:sz w:val="48"/>
+          <w:szCs w:val="48"/>
+        </w:rPr>
+        <w:t>DRM Policy Diagnostic Tool</w:t>
       </w:r>
     </w:p>
     <w:p>
@@ -268,227 +297,227 @@
       </w:pPr>
       <w:r>
         <w:rPr>
-          <w:rFonts w:eastAsiaTheme="minorEastAsia"/>
-          <w:b/>
-          <w:bCs/>
+          <w:rFonts w:eastAsia="游ゴシック" w:eastAsiaTheme="minorEastAsia"/>
+          <w:b w:val="1"/>
+          <w:bCs w:val="1"/>
         </w:rPr>
         <w:t>T</w:t>
       </w:r>
       <w:r>
         <w:rPr>
-          <w:rFonts w:eastAsiaTheme="minorEastAsia"/>
-          <w:b/>
-          <w:bCs/>
+          <w:rFonts w:eastAsia="游ゴシック" w:eastAsiaTheme="minorEastAsia"/>
+          <w:b w:val="1"/>
+          <w:bCs w:val="1"/>
         </w:rPr>
         <w:t>o address this gap, th</w:t>
       </w:r>
       <w:r>
         <w:rPr>
-          <w:rFonts w:eastAsiaTheme="minorEastAsia"/>
-          <w:b/>
-          <w:bCs/>
+          <w:rFonts w:eastAsia="游ゴシック" w:eastAsiaTheme="minorEastAsia"/>
+          <w:b w:val="1"/>
+          <w:bCs w:val="1"/>
         </w:rPr>
         <w:t>is t</w:t>
       </w:r>
       <w:r>
         <w:rPr>
-          <w:rFonts w:eastAsiaTheme="minorEastAsia"/>
-          <w:b/>
-          <w:bCs/>
+          <w:rFonts w:eastAsia="游ゴシック" w:eastAsiaTheme="minorEastAsia"/>
+          <w:b w:val="1"/>
+          <w:bCs w:val="1"/>
         </w:rPr>
         <w:t xml:space="preserve">ool </w:t>
       </w:r>
       <w:r>
         <w:rPr>
-          <w:rFonts w:eastAsiaTheme="minorEastAsia"/>
-          <w:b/>
-          <w:bCs/>
+          <w:rFonts w:eastAsia="游ゴシック" w:eastAsiaTheme="minorEastAsia"/>
+          <w:b w:val="1"/>
+          <w:bCs w:val="1"/>
         </w:rPr>
         <w:t>provide</w:t>
       </w:r>
       <w:r>
         <w:rPr>
-          <w:rFonts w:eastAsiaTheme="minorEastAsia"/>
-          <w:b/>
-          <w:bCs/>
+          <w:rFonts w:eastAsia="游ゴシック" w:eastAsiaTheme="minorEastAsia"/>
+          <w:b w:val="1"/>
+          <w:bCs w:val="1"/>
         </w:rPr>
         <w:t>s</w:t>
       </w:r>
       <w:r>
         <w:rPr>
-          <w:rFonts w:eastAsiaTheme="minorEastAsia"/>
-          <w:b/>
-          <w:bCs/>
+          <w:rFonts w:eastAsia="游ゴシック" w:eastAsiaTheme="minorEastAsia"/>
+          <w:b w:val="1"/>
+          <w:bCs w:val="1"/>
         </w:rPr>
         <w:t xml:space="preserve"> a </w:t>
       </w:r>
       <w:r>
         <w:rPr>
-          <w:rFonts w:eastAsiaTheme="minorEastAsia"/>
-          <w:b/>
-          <w:bCs/>
+          <w:rFonts w:eastAsia="游ゴシック" w:eastAsiaTheme="minorEastAsia"/>
+          <w:b w:val="1"/>
+          <w:bCs w:val="1"/>
         </w:rPr>
         <w:t>high-level</w:t>
       </w:r>
       <w:r>
         <w:rPr>
-          <w:rFonts w:eastAsiaTheme="minorEastAsia"/>
-          <w:b/>
-          <w:bCs/>
+          <w:rFonts w:eastAsia="游ゴシック" w:eastAsiaTheme="minorEastAsia"/>
+          <w:b w:val="1"/>
+          <w:bCs w:val="1"/>
         </w:rPr>
         <w:t xml:space="preserve">, </w:t>
       </w:r>
       <w:r>
         <w:rPr>
-          <w:rFonts w:eastAsiaTheme="minorEastAsia"/>
-          <w:b/>
-          <w:bCs/>
+          <w:rFonts w:eastAsia="游ゴシック" w:eastAsiaTheme="minorEastAsia"/>
+          <w:b w:val="1"/>
+          <w:bCs w:val="1"/>
         </w:rPr>
         <w:t xml:space="preserve">rapid </w:t>
       </w:r>
       <w:r>
         <w:rPr>
-          <w:rFonts w:eastAsiaTheme="minorEastAsia"/>
-          <w:b/>
-          <w:bCs/>
+          <w:rFonts w:eastAsia="游ゴシック" w:eastAsiaTheme="minorEastAsia"/>
+          <w:b w:val="1"/>
+          <w:bCs w:val="1"/>
         </w:rPr>
         <w:t>assessment</w:t>
       </w:r>
       <w:r>
         <w:rPr>
-          <w:rFonts w:eastAsiaTheme="minorEastAsia"/>
-          <w:b/>
-          <w:bCs/>
+          <w:rFonts w:eastAsia="游ゴシック" w:eastAsiaTheme="minorEastAsia"/>
+          <w:b w:val="1"/>
+          <w:bCs w:val="1"/>
         </w:rPr>
         <w:t xml:space="preserve"> of a country’s DRM policy framework</w:t>
       </w:r>
       <w:r>
         <w:rPr>
-          <w:rFonts w:eastAsiaTheme="minorEastAsia"/>
+          <w:rFonts w:eastAsia="游ゴシック" w:eastAsiaTheme="minorEastAsia"/>
         </w:rPr>
         <w:t>.</w:t>
       </w:r>
       <w:r>
         <w:rPr>
-          <w:rFonts w:eastAsiaTheme="minorEastAsia"/>
+          <w:rFonts w:eastAsia="游ゴシック" w:eastAsiaTheme="minorEastAsia"/>
         </w:rPr>
         <w:t xml:space="preserve"> </w:t>
       </w:r>
       <w:r>
         <w:rPr>
-          <w:rFonts w:eastAsiaTheme="minorEastAsia"/>
+          <w:rFonts w:eastAsia="游ゴシック" w:eastAsiaTheme="minorEastAsia"/>
         </w:rPr>
         <w:t xml:space="preserve">It evaluates </w:t>
       </w:r>
       <w:r>
         <w:rPr>
-          <w:rFonts w:eastAsiaTheme="minorEastAsia"/>
+          <w:rFonts w:eastAsia="游ゴシック" w:eastAsiaTheme="minorEastAsia"/>
         </w:rPr>
         <w:t>national DRM policy framework</w:t>
       </w:r>
       <w:r>
         <w:rPr>
-          <w:rFonts w:eastAsiaTheme="minorEastAsia"/>
+          <w:rFonts w:eastAsia="游ゴシック" w:eastAsiaTheme="minorEastAsia"/>
         </w:rPr>
         <w:t>s</w:t>
       </w:r>
       <w:r>
         <w:rPr>
-          <w:rFonts w:eastAsiaTheme="minorEastAsia"/>
+          <w:rFonts w:eastAsia="游ゴシック" w:eastAsiaTheme="minorEastAsia"/>
         </w:rPr>
         <w:t xml:space="preserve"> against a </w:t>
       </w:r>
       <w:r>
         <w:rPr>
-          <w:rFonts w:eastAsiaTheme="minorEastAsia"/>
+          <w:rFonts w:eastAsia="游ゴシック" w:eastAsiaTheme="minorEastAsia"/>
         </w:rPr>
         <w:t xml:space="preserve">standard </w:t>
       </w:r>
       <w:r>
         <w:rPr>
-          <w:rFonts w:eastAsiaTheme="minorEastAsia"/>
+          <w:rFonts w:eastAsia="游ゴシック" w:eastAsiaTheme="minorEastAsia"/>
         </w:rPr>
         <w:t>global</w:t>
       </w:r>
       <w:r>
         <w:rPr>
-          <w:rFonts w:eastAsiaTheme="minorEastAsia"/>
+          <w:rFonts w:eastAsia="游ゴシック" w:eastAsiaTheme="minorEastAsia"/>
         </w:rPr>
         <w:t xml:space="preserve"> </w:t>
       </w:r>
       <w:r>
         <w:rPr>
-          <w:rFonts w:eastAsiaTheme="minorEastAsia"/>
+          <w:rFonts w:eastAsia="游ゴシック" w:eastAsiaTheme="minorEastAsia"/>
         </w:rPr>
         <w:t>benchmark</w:t>
       </w:r>
       <w:r>
         <w:rPr>
-          <w:rFonts w:eastAsiaTheme="minorEastAsia"/>
+          <w:rFonts w:eastAsia="游ゴシック" w:eastAsiaTheme="minorEastAsia"/>
         </w:rPr>
         <w:t xml:space="preserve"> </w:t>
       </w:r>
       <w:r>
         <w:rPr>
-          <w:rFonts w:eastAsiaTheme="minorEastAsia"/>
+          <w:rFonts w:eastAsia="游ゴシック" w:eastAsiaTheme="minorEastAsia"/>
         </w:rPr>
         <w:t xml:space="preserve">that reflects </w:t>
       </w:r>
       <w:r>
         <w:rPr>
-          <w:rFonts w:eastAsiaTheme="minorEastAsia"/>
+          <w:rFonts w:eastAsia="游ゴシック" w:eastAsiaTheme="minorEastAsia"/>
         </w:rPr>
         <w:t xml:space="preserve">lessons learned and </w:t>
       </w:r>
       <w:bookmarkStart w:name="_Int_umh1gKff" w:id="0"/>
       <w:r>
         <w:rPr>
-          <w:rFonts w:eastAsiaTheme="minorEastAsia"/>
+          <w:rFonts w:eastAsia="游ゴシック" w:eastAsiaTheme="minorEastAsia"/>
         </w:rPr>
         <w:t>established</w:t>
       </w:r>
       <w:bookmarkEnd w:id="0"/>
       <w:r>
         <w:rPr>
-          <w:rFonts w:eastAsiaTheme="minorEastAsia"/>
+          <w:rFonts w:eastAsia="游ゴシック" w:eastAsiaTheme="minorEastAsia"/>
         </w:rPr>
         <w:t xml:space="preserve"> </w:t>
       </w:r>
       <w:r>
         <w:rPr>
-          <w:rFonts w:eastAsiaTheme="minorEastAsia"/>
+          <w:rFonts w:eastAsia="游ゴシック" w:eastAsiaTheme="minorEastAsia"/>
         </w:rPr>
         <w:t>good practices</w:t>
       </w:r>
       <w:r>
         <w:rPr>
-          <w:rFonts w:eastAsiaTheme="minorEastAsia"/>
+          <w:rFonts w:eastAsia="游ゴシック" w:eastAsiaTheme="minorEastAsia"/>
         </w:rPr>
         <w:t xml:space="preserve"> underpin</w:t>
       </w:r>
       <w:r>
         <w:rPr>
-          <w:rFonts w:eastAsiaTheme="minorEastAsia"/>
+          <w:rFonts w:eastAsia="游ゴシック" w:eastAsiaTheme="minorEastAsia"/>
         </w:rPr>
         <w:t>ning</w:t>
       </w:r>
       <w:r>
         <w:rPr>
-          <w:rFonts w:eastAsiaTheme="minorEastAsia"/>
+          <w:rFonts w:eastAsia="游ゴシック" w:eastAsiaTheme="minorEastAsia"/>
         </w:rPr>
         <w:t xml:space="preserve"> effective DRM systems.</w:t>
       </w:r>
       <w:r>
         <w:rPr>
           <w:rStyle w:val="FootnoteReference"/>
-          <w:rFonts w:eastAsiaTheme="minorEastAsia"/>
+          <w:rFonts w:eastAsia="游ゴシック" w:eastAsiaTheme="minorEastAsia"/>
         </w:rPr>
         <w:footnoteReference w:id="1"/>
       </w:r>
       <w:r>
         <w:rPr>
           <w:rStyle w:val="FootnoteReference"/>
-          <w:rFonts w:eastAsiaTheme="minorEastAsia"/>
+          <w:rFonts w:eastAsia="游ゴシック" w:eastAsiaTheme="minorEastAsia"/>
         </w:rPr>
         <w:t xml:space="preserve"> </w:t>
       </w:r>
@@ -805,119 +834,129 @@
       </w:pPr>
       <w:r>
         <w:rPr>
-          <w:b/>
-          <w:bCs/>
+          <w:b w:val="1"/>
+          <w:bCs w:val="1"/>
         </w:rPr>
         <w:t>T</w:t>
       </w:r>
       <w:r>
         <w:rPr>
-          <w:b/>
-          <w:bCs/>
+          <w:b w:val="1"/>
+          <w:bCs w:val="1"/>
         </w:rPr>
         <w:t xml:space="preserve">he diagnostic </w:t>
       </w:r>
       <w:r>
         <w:rPr>
-          <w:b/>
-          <w:bCs/>
+          <w:b w:val="1"/>
+          <w:bCs w:val="1"/>
         </w:rPr>
         <w:t>should be understood as an entry point for structured policy dialogue rather than a definitive or exhaustive assessment</w:t>
       </w:r>
       <w:r>
+        <w:rPr/>
         <w:t xml:space="preserve">. It </w:t>
       </w:r>
       <w:r>
+        <w:rPr/>
         <w:t xml:space="preserve">can be </w:t>
       </w:r>
       <w:r>
+        <w:rPr/>
         <w:t>applied periodically t</w:t>
       </w:r>
       <w:r>
+        <w:rPr/>
         <w:t xml:space="preserve">o </w:t>
       </w:r>
       <w:r>
+        <w:rPr/>
         <w:t xml:space="preserve">monitor changes in policy maturity and track reform progress over time. </w:t>
       </w:r>
       <w:r>
         <w:rPr>
-          <w:rFonts w:eastAsiaTheme="minorEastAsia"/>
+          <w:rFonts w:eastAsia="游ゴシック" w:eastAsiaTheme="minorEastAsia"/>
         </w:rPr>
         <w:t xml:space="preserve">Importantly, while the diagnostic highlights the </w:t>
       </w:r>
       <w:r>
         <w:rPr>
-          <w:rFonts w:eastAsiaTheme="minorEastAsia"/>
+          <w:rFonts w:eastAsia="游ゴシック" w:eastAsiaTheme="minorEastAsia"/>
         </w:rPr>
         <w:t>distance</w:t>
       </w:r>
       <w:r>
         <w:rPr>
-          <w:rFonts w:eastAsiaTheme="minorEastAsia"/>
+          <w:rFonts w:eastAsia="游ゴシック" w:eastAsiaTheme="minorEastAsia"/>
         </w:rPr>
         <w:t xml:space="preserve"> between the current policy setting and </w:t>
       </w:r>
       <w:r>
         <w:rPr>
-          <w:rFonts w:eastAsiaTheme="minorEastAsia"/>
+          <w:rFonts w:eastAsia="游ゴシック" w:eastAsiaTheme="minorEastAsia"/>
         </w:rPr>
         <w:t>a</w:t>
       </w:r>
       <w:r>
         <w:rPr>
-          <w:rFonts w:eastAsiaTheme="minorEastAsia"/>
+          <w:rFonts w:eastAsia="游ゴシック" w:eastAsiaTheme="minorEastAsia"/>
         </w:rPr>
         <w:t xml:space="preserve"> standard </w:t>
       </w:r>
       <w:r>
+        <w:rPr/>
         <w:t>benchmark</w:t>
       </w:r>
       <w:r>
+        <w:rPr/>
         <w:t xml:space="preserve"> framework</w:t>
       </w:r>
       <w:r>
         <w:rPr>
-          <w:rFonts w:eastAsiaTheme="minorEastAsia"/>
+          <w:rFonts w:eastAsia="游ゴシック" w:eastAsiaTheme="minorEastAsia"/>
         </w:rPr>
         <w:t xml:space="preserve">, it </w:t>
       </w:r>
       <w:r>
         <w:rPr>
-          <w:rFonts w:eastAsiaTheme="minorEastAsia"/>
+          <w:rFonts w:eastAsia="游ゴシック" w:eastAsiaTheme="minorEastAsia"/>
         </w:rPr>
         <w:t xml:space="preserve">does not provide </w:t>
       </w:r>
       <w:r>
         <w:rPr>
-          <w:rFonts w:eastAsiaTheme="minorEastAsia"/>
+          <w:rFonts w:eastAsia="游ゴシック" w:eastAsiaTheme="minorEastAsia"/>
         </w:rPr>
         <w:t xml:space="preserve">prescriptive guidance on the future development of </w:t>
       </w:r>
       <w:r>
         <w:rPr>
-          <w:rFonts w:eastAsiaTheme="minorEastAsia"/>
+          <w:rFonts w:eastAsia="游ゴシック" w:eastAsiaTheme="minorEastAsia"/>
         </w:rPr>
         <w:t>the</w:t>
       </w:r>
       <w:r>
         <w:rPr>
-          <w:rFonts w:eastAsiaTheme="minorEastAsia"/>
+          <w:rFonts w:eastAsia="游ゴシック" w:eastAsiaTheme="minorEastAsia"/>
         </w:rPr>
         <w:t xml:space="preserve"> DRM system. </w:t>
       </w:r>
       <w:r>
+        <w:rPr/>
         <w:t>It should</w:t>
       </w:r>
       <w:r>
+        <w:rPr/>
         <w:t xml:space="preserve"> </w:t>
       </w:r>
       <w:r>
+        <w:rPr/>
         <w:t>be complemented with more in-depth analysis and qualitative insights to further advance the understanding of existing DRM practices and provide relevant policy advice.</w:t>
       </w:r>
       <w:r>
         <w:rPr>
           <w:rStyle w:val="FootnoteReference"/>
-          <w:rFonts w:eastAsiaTheme="minorEastAsia"/>
+          <w:rFonts w:eastAsia="游ゴシック" w:eastAsiaTheme="minorEastAsia"/>
         </w:rPr>
         <w:footnoteReference w:id="2"/>
       </w:r>
@@ -1092,98 +1131,100 @@
       </w:pPr>
       <w:r>
         <w:rPr>
-          <w:b/>
-          <w:bCs/>
+          <w:b w:val="1"/>
+          <w:bCs w:val="1"/>
         </w:rPr>
         <w:t>Recogniz</w:t>
       </w:r>
       <w:r>
+        <w:rPr/>
         <w:t>i</w:t>
       </w:r>
       <w:r>
         <w:rPr>
-          <w:b/>
-          <w:bCs/>
+          <w:b w:val="1"/>
+          <w:bCs w:val="1"/>
         </w:rPr>
         <w:t>ng this, the</w:t>
       </w:r>
       <w:r>
+        <w:rPr/>
         <w:t xml:space="preserve"> </w:t>
       </w:r>
       <w:r>
         <w:rPr>
-          <w:b/>
-          <w:bCs/>
+          <w:b w:val="1"/>
+          <w:bCs w:val="1"/>
         </w:rPr>
         <w:t>tool</w:t>
       </w:r>
       <w:r>
         <w:rPr>
-          <w:b/>
-          <w:bCs/>
+          <w:b w:val="1"/>
+          <w:bCs w:val="1"/>
         </w:rPr>
         <w:t xml:space="preserve"> </w:t>
       </w:r>
       <w:r>
         <w:rPr>
-          <w:b/>
-          <w:bCs/>
+          <w:b w:val="1"/>
+          <w:bCs w:val="1"/>
         </w:rPr>
         <w:t xml:space="preserve">draws upon </w:t>
       </w:r>
       <w:r>
         <w:rPr>
-          <w:b/>
-          <w:bCs/>
+          <w:b w:val="1"/>
+          <w:bCs w:val="1"/>
         </w:rPr>
         <w:t>the</w:t>
       </w:r>
       <w:r>
         <w:rPr>
-          <w:b/>
-          <w:bCs/>
+          <w:b w:val="1"/>
+          <w:bCs w:val="1"/>
         </w:rPr>
         <w:t xml:space="preserve"> World Bank DRM framework</w:t>
       </w:r>
       <w:r>
         <w:rPr>
-          <w:b/>
-          <w:bCs/>
+          <w:b w:val="1"/>
+          <w:bCs w:val="1"/>
         </w:rPr>
         <w:t xml:space="preserve"> </w:t>
       </w:r>
       <w:r>
         <w:rPr>
-          <w:b/>
-          <w:bCs/>
+          <w:b w:val="1"/>
+          <w:bCs w:val="1"/>
         </w:rPr>
         <w:t xml:space="preserve">to </w:t>
       </w:r>
       <w:r>
         <w:rPr>
-          <w:b/>
-          <w:bCs/>
+          <w:b w:val="1"/>
+          <w:bCs w:val="1"/>
         </w:rPr>
         <w:t>p</w:t>
       </w:r>
       <w:r>
         <w:rPr>
-          <w:b/>
-          <w:bCs/>
+          <w:b w:val="1"/>
+          <w:bCs w:val="1"/>
         </w:rPr>
         <w:t>rovide</w:t>
       </w:r>
       <w:r>
         <w:rPr>
-          <w:b/>
-          <w:bCs/>
+          <w:b w:val="1"/>
+          <w:bCs w:val="1"/>
         </w:rPr>
         <w:t xml:space="preserve"> a structured approach to evaluate a country's policy and institutional setup for DRM</w:t>
       </w:r>
       <w:r>
         <w:rPr>
-          <w:b/>
-          <w:bCs/>
+          <w:b w:val="1"/>
+          <w:bCs w:val="1"/>
         </w:rPr>
         <w:t>.</w:t>
       </w:r>
@@ -1195,42 +1236,49 @@
       </w:r>
       <w:r>
         <w:rPr>
-          <w:b/>
-          <w:bCs/>
+          <w:b w:val="1"/>
+          <w:bCs w:val="1"/>
         </w:rPr>
         <w:t xml:space="preserve"> </w:t>
       </w:r>
       <w:r>
+        <w:rPr/>
         <w:t xml:space="preserve">This framework is organized around six essential DRM </w:t>
       </w:r>
       <w:r>
         <w:rPr>
-          <w:rFonts w:eastAsiaTheme="minorEastAsia"/>
+          <w:rFonts w:eastAsia="游ゴシック" w:eastAsiaTheme="minorEastAsia"/>
         </w:rPr>
         <w:t>policy dimensions</w:t>
       </w:r>
       <w:r>
         <w:rPr>
-          <w:rFonts w:eastAsiaTheme="minorEastAsia"/>
+          <w:rFonts w:eastAsia="游ゴシック" w:eastAsiaTheme="minorEastAsia"/>
         </w:rPr>
         <w:t xml:space="preserve"> </w:t>
       </w:r>
       <w:r>
+        <w:rPr/>
         <w:t>that help</w:t>
       </w:r>
       <w:r>
+        <w:rPr/>
         <w:t xml:space="preserve"> </w:t>
       </w:r>
       <w:r>
+        <w:rPr/>
         <w:t>shape</w:t>
       </w:r>
       <w:r>
+        <w:rPr/>
         <w:t xml:space="preserve"> </w:t>
       </w:r>
       <w:r>
+        <w:rPr/>
         <w:t xml:space="preserve">the </w:t>
       </w:r>
       <w:r>
+        <w:rPr/>
         <w:t>DRM policy dialogue at the country level and identify key institutional counterparts for engagement.</w:t>
       </w:r>
     </w:p>
@@ -1544,15 +1592,7 @@
       </w:r>
       <w:r>
         <w:rPr/>
-        <w:t>questionnaire (</w:t>
-      </w:r>
-      <w:r>
-        <w:rPr/>
-        <w:t>included in annex 1</w:t>
-      </w:r>
-      <w:r>
-        <w:rPr/>
-        <w:t>)</w:t>
+        <w:t>questionnaire</w:t>
       </w:r>
       <w:r>
         <w:rPr/>
@@ -1594,7 +1634,7 @@
       </w:r>
       <w:r>
         <w:rPr/>
-        <w:t xml:space="preserve">indicates</w:t>
+        <w:t>indicates</w:t>
       </w:r>
       <w:r>
         <w:rPr/>
@@ -1602,7 +1642,7 @@
       </w:r>
       <w:r>
         <w:rPr/>
-        <w:t xml:space="preserve">required</w:t>
+        <w:t>required</w:t>
       </w:r>
       <w:r>
         <w:rPr/>
@@ -2041,8 +2081,8 @@
       </w:pPr>
       <w:r>
         <w:drawing>
-          <wp:inline wp14:editId="50E4692A" wp14:anchorId="319A73DA">
-            <wp:extent cx="5724525" cy="1009650"/>
+          <wp:inline wp14:editId="4B2D5798" wp14:anchorId="319A73DA">
+            <wp:extent cx="5724525" cy="838201"/>
             <wp:effectExtent l="0" t="0" r="0" b="0"/>
             <wp:docPr id="271582621" name="drawing"/>
             <wp:cNvGraphicFramePr>
@@ -2063,14 +2103,15 @@
                         </a:ext>
                       </a:extLst>
                     </a:blip>
+                    <a:srcRect l="0" t="16981" r="0" b="0"/>
                     <a:stretch>
                       <a:fillRect/>
                     </a:stretch>
                   </pic:blipFill>
                   <pic:spPr>
-                    <a:xfrm>
+                    <a:xfrm rot="0">
                       <a:off x="0" y="0"/>
-                      <a:ext cx="5724525" cy="1009650"/>
+                      <a:ext cx="5724525" cy="838201"/>
                     </a:xfrm>
                     <a:prstGeom prst="rect">
                       <a:avLst/>
@@ -2483,16 +2524,61 @@
       </w:r>
       <w:r>
         <w:rPr/>
-        <w:t>On the other hand, progress across different petals reflects the extent of DRM mainstreaming across key sectors.</w:t>
+        <w:t>On the other hand, progress across petals reflects the extent of DRM mainstreaming across sectors.</w:t>
       </w:r>
     </w:p>
     <w:p>
-      <w:r>
-        <w:br w:type="page"/>
+      <w:pPr>
+        <w:spacing w:before="120" w:after="120"/>
+        <w:jc w:val="both"/>
+      </w:pPr>
+      <w:r>
+        <w:rPr>
+          <w:b w:val="1"/>
+          <w:bCs w:val="1"/>
+        </w:rPr>
+        <w:t>Together, these dimensions provide key insights into the overall maturity of the national DRM system</w:t>
+      </w:r>
+      <w:r>
+        <w:rPr>
+          <w:b w:val="1"/>
+          <w:bCs w:val="1"/>
+        </w:rPr>
+        <w:t xml:space="preserve">. </w:t>
+      </w:r>
+      <w:r>
+        <w:rPr/>
+        <w:t xml:space="preserve">Countries with mature DRM systems typically have most petals exceeding the nascent level, with some approaching the frontier (i.e., exhibiting a level of advances close to the global benchmark frontier). Results are also aggregated by DRM </w:t>
+      </w:r>
+      <w:r>
+        <w:rPr/>
+        <w:t>pillar</w:t>
+      </w:r>
+      <w:r>
+        <w:rPr/>
+        <w:t xml:space="preserve"> to highlight key strengths and gaps in a more succinct way</w:t>
+      </w:r>
+      <w:r>
+        <w:rPr/>
+        <w:t xml:space="preserve">. </w:t>
+      </w:r>
+      <w:r>
+        <w:rPr/>
+        <w:t>Finally, a text generated through a Large Language Model summarizes the results</w:t>
+      </w:r>
+      <w:r>
+        <w:rPr/>
+        <w:t>.</w:t>
       </w:r>
     </w:p>
     <w:p>
-      <w:pPr>
+      <w:r>
+        <w:br w:type="page"/>
+      </w:r>
+    </w:p>
+    <w:p>
+      <w:pPr>
+        <w:pStyle w:val="Normal"/>
         <w:spacing w:after="80"/>
         <w:jc w:val="center"/>
         <w:rPr>
@@ -2611,8 +2697,8 @@
       </w:pPr>
       <w:r>
         <w:drawing>
-          <wp:inline wp14:editId="277C34AA" wp14:anchorId="2F2E0806">
-            <wp:extent cx="4930694" cy="4200525"/>
+          <wp:inline wp14:editId="5A2C1784" wp14:anchorId="2F2E0806">
+            <wp:extent cx="4635043" cy="3885991"/>
             <wp:effectExtent l="0" t="0" r="0" b="0"/>
             <wp:docPr id="1711642642" name="drawing"/>
             <wp:cNvGraphicFramePr>
@@ -2633,6 +2719,7 @@
                         </a:ext>
                       </a:extLst>
                     </a:blip>
+                    <a:srcRect l="0" t="0" r="0" b="1587"/>
                     <a:stretch>
                       <a:fillRect/>
                     </a:stretch>
@@ -2640,7 +2727,7 @@
                   <pic:spPr>
                     <a:xfrm rot="0">
                       <a:off x="0" y="0"/>
-                      <a:ext cx="4930694" cy="4200525"/>
+                      <a:ext cx="4635043" cy="3885991"/>
                     </a:xfrm>
                     <a:prstGeom prst="rect">
                       <a:avLst/>
@@ -2655,154 +2742,57 @@
     </w:p>
     <w:p>
       <w:pPr>
-        <w:spacing w:before="120" w:after="120"/>
-        <w:jc w:val="both"/>
-      </w:pPr>
-      <w:r>
-        <w:rPr>
-          <w:b/>
-          <w:bCs/>
-        </w:rPr>
-        <w:t>Together, these dimensions provide key insights into the overall maturity of the national DRM system</w:t>
-      </w:r>
-      <w:r>
-        <w:rPr>
-          <w:b/>
-          <w:bCs/>
+        <w:spacing w:after="80"/>
+        <w:jc w:val="center"/>
+      </w:pPr>
+      <w:r>
+        <w:rPr>
+          <w:b w:val="1"/>
+          <w:bCs w:val="1"/>
+        </w:rPr>
+        <w:t xml:space="preserve">Figure </w:t>
+      </w:r>
+      <w:r>
+        <w:rPr>
+          <w:b w:val="1"/>
+          <w:bCs w:val="1"/>
+        </w:rPr>
+        <w:t>4</w:t>
+      </w:r>
+      <w:r>
+        <w:rPr>
+          <w:b w:val="1"/>
+          <w:bCs w:val="1"/>
         </w:rPr>
         <w:t xml:space="preserve">. </w:t>
       </w:r>
       <w:r>
-        <w:t>Countries with mature DRM systems typically hav</w:t>
-      </w:r>
-      <w:r>
-        <w:t>e</w:t>
-      </w:r>
-      <w:r>
-        <w:t xml:space="preserve"> most petals exceeding the nascent level, with some approaching the frontier (i.e., exhibiting a level of advances close to the global benchmark frontier). </w:t>
-      </w:r>
-      <w:r>
-        <w:t>R</w:t>
-      </w:r>
-      <w:r>
-        <w:t>esults are</w:t>
-      </w:r>
-      <w:r>
-        <w:t xml:space="preserve"> also</w:t>
-      </w:r>
-      <w:r>
-        <w:t xml:space="preserve"> aggregated by DRM </w:t>
-      </w:r>
-      <w:bookmarkStart w:name="_Int_5RVic2Wf" w:id="1"/>
-      <w:r>
-        <w:t>pillar</w:t>
-      </w:r>
-      <w:bookmarkEnd w:id="1"/>
-      <w:r>
-        <w:t xml:space="preserve"> to highlight key </w:t>
-      </w:r>
-      <w:r>
-        <w:t>streng</w:t>
-      </w:r>
-      <w:r>
-        <w:t>t</w:t>
-      </w:r>
-      <w:r>
-        <w:t>hs</w:t>
-      </w:r>
-      <w:r>
-        <w:t xml:space="preserve"> and gaps</w:t>
-      </w:r>
-      <w:r>
-        <w:t xml:space="preserve"> in a more succinct way</w:t>
-      </w:r>
-      <w:r>
-        <w:t>.</w:t>
-      </w:r>
-      <w:r>
-        <w:t xml:space="preserve"> </w:t>
-      </w:r>
-      <w:r>
-        <w:t>Finally, a</w:t>
-      </w:r>
-      <w:r>
-        <w:t xml:space="preserve"> text generated through </w:t>
-      </w:r>
-      <w:r>
-        <w:t xml:space="preserve">a </w:t>
-      </w:r>
-      <w:r>
-        <w:t>Large Language Model</w:t>
-      </w:r>
-      <w:r>
-        <w:t xml:space="preserve"> summari</w:t>
-      </w:r>
-      <w:r>
-        <w:t>zes th</w:t>
-      </w:r>
-      <w:r>
-        <w:t>e</w:t>
-      </w:r>
-      <w:r>
-        <w:t xml:space="preserve"> results</w:t>
-      </w:r>
-      <w:r>
-        <w:t>.</w:t>
+        <w:rPr/>
+        <w:t xml:space="preserve">Illustrative </w:t>
+      </w:r>
+      <w:r>
+        <w:rPr/>
+        <w:t>example</w:t>
+      </w:r>
+      <w:r>
+        <w:rPr/>
+        <w:t xml:space="preserve"> of r</w:t>
+      </w:r>
+      <w:r>
+        <w:rPr/>
+        <w:t>esults by DRM Pillar</w:t>
       </w:r>
     </w:p>
     <w:p>
       <w:pPr>
-        <w:spacing w:after="80"/>
+        <w:pStyle w:val="Normal"/>
+        <w:spacing w:before="120" w:after="80" w:line="276" w:lineRule="auto"/>
         <w:jc w:val="center"/>
       </w:pPr>
       <w:r>
-        <w:rPr>
-          <w:b w:val="1"/>
-          <w:bCs w:val="1"/>
-        </w:rPr>
-        <w:t xml:space="preserve">Figure </w:t>
-      </w:r>
-      <w:r>
-        <w:rPr>
-          <w:b w:val="1"/>
-          <w:bCs w:val="1"/>
-        </w:rPr>
-        <w:t>4</w:t>
-      </w:r>
-      <w:r>
-        <w:rPr>
-          <w:b w:val="1"/>
-          <w:bCs w:val="1"/>
-        </w:rPr>
-        <w:t xml:space="preserve">. </w:t>
-      </w:r>
-      <w:r>
-        <w:rPr/>
-        <w:t xml:space="preserve">Illustrative </w:t>
-      </w:r>
-      <w:r>
-        <w:rPr/>
-        <w:t>example</w:t>
-      </w:r>
-      <w:r>
-        <w:rPr/>
-        <w:t xml:space="preserve"> of r</w:t>
-      </w:r>
-      <w:r>
-        <w:rPr/>
-        <w:t xml:space="preserve">esults by DRM Pillar </w:t>
-      </w:r>
-    </w:p>
-    <w:p>
-      <w:pPr>
-        <w:pStyle w:val="Normal"/>
-        <w:spacing w:after="80"/>
-        <w:jc w:val="center"/>
-      </w:pPr>
-      <w:r>
         <w:drawing>
-          <wp:inline wp14:editId="6DC07802" wp14:anchorId="357BE12B">
-            <wp:extent cx="5172075" cy="2203080"/>
+          <wp:inline wp14:editId="577D739F" wp14:anchorId="357BE12B">
+            <wp:extent cx="4724276" cy="2012337"/>
             <wp:effectExtent l="0" t="0" r="0" b="0"/>
             <wp:docPr id="815859948" name="drawing"/>
             <wp:cNvGraphicFramePr>
@@ -2830,7 +2820,7 @@
                   <pic:spPr>
                     <a:xfrm rot="0">
                       <a:off x="0" y="0"/>
-                      <a:ext cx="5172075" cy="2203080"/>
+                      <a:ext cx="4724276" cy="2012337"/>
                     </a:xfrm>
                     <a:prstGeom prst="rect">
                       <a:avLst/>
@@ -2850,1612 +2840,38 @@
       </w:pPr>
       <w:r>
         <w:rPr>
-          <w:b/>
-          <w:bCs/>
+          <w:b w:val="1"/>
+          <w:bCs w:val="1"/>
         </w:rPr>
         <w:t>To conclude, it is important to note that countries differ widely in governance structures, socio-economic conditions, and institutional capacity. Progress across DRM thematic areas and policy dimensions is therefore not linear</w:t>
       </w:r>
       <w:r>
-        <w:t>. Countries face diverse risk profiles and operate within distinct legislative and institutional environments in which their DRM systems must evolve. In lower-capacity settings, specific thematic areas may fall into the nascent category not because reforms are weak or insignificant, but because DRM systems remain at an early stage of development and are not yet producing the outputs captured by the binary questions. Conversely, countries with long-standing DRM systems may be delivering some of the targeted outputs even where the underlying legal and regulatory framework remains comparatively weak.</w:t>
-      </w:r>
-    </w:p>
-    <w:p>
-      <w:pPr>
-        <w:spacing w:before="120" w:after="120" w:line="276" w:lineRule="auto"/>
-        <w:jc w:val="center"/>
-      </w:pPr>
-      <w:r>
-        <w:br w:type="page"/>
-      </w:r>
-    </w:p>
-    <w:p>
-      <w:pPr>
-        <w:spacing w:before="120" w:after="120"/>
-        <w:jc w:val="both"/>
-        <w:rPr>
-          <w:b/>
-          <w:bCs/>
-          <w:color w:val="0070C0"/>
-          <w:sz w:val="24"/>
-          <w:szCs w:val="24"/>
-        </w:rPr>
-      </w:pPr>
-      <w:r>
-        <w:rPr>
-          <w:b/>
-          <w:bCs/>
-          <w:color w:val="0070C0"/>
-          <w:sz w:val="24"/>
-          <w:szCs w:val="24"/>
-        </w:rPr>
-        <w:t>Annex</w:t>
-      </w:r>
-      <w:r>
-        <w:rPr>
-          <w:b/>
-          <w:bCs/>
-          <w:color w:val="0070C0"/>
-          <w:sz w:val="24"/>
-          <w:szCs w:val="24"/>
-        </w:rPr>
-        <w:t>: Questionnaire</w:t>
-      </w:r>
-      <w:r>
-        <w:rPr>
-          <w:b/>
-          <w:bCs/>
-          <w:color w:val="0070C0"/>
-          <w:sz w:val="24"/>
-          <w:szCs w:val="24"/>
-        </w:rPr>
-        <w:t xml:space="preserve"> (Yes / No)</w:t>
-      </w:r>
-    </w:p>
-    <w:p>
-      <w:pPr>
-        <w:pStyle w:val="ListParagraph"/>
-        <w:numPr>
-          <w:ilvl w:val="0"/>
-          <w:numId w:val="8"/>
-        </w:numPr>
-        <w:spacing w:before="80" w:after="80"/>
-        <w:contextualSpacing w:val="0"/>
-        <w:jc w:val="both"/>
-        <w:rPr>
-          <w:rFonts w:eastAsia="Times New Roman" w:cs="Times New Roman"/>
-          <w:b/>
-          <w:bCs/>
-          <w:color w:val="000000"/>
-          <w:kern w:val="0"/>
-          <w:u w:val="single"/>
-          <w:lang w:bidi="ar-SA"/>
-          <w14:ligatures w14:val="none"/>
-        </w:rPr>
-      </w:pPr>
-      <w:r>
-        <w:rPr>
-          <w:rFonts w:eastAsia="Times New Roman" w:cs="Times New Roman"/>
-          <w:b/>
-          <w:bCs/>
-          <w:color w:val="000000"/>
-          <w:kern w:val="0"/>
-          <w:u w:val="single"/>
-          <w:lang w:bidi="ar-SA"/>
-          <w14:ligatures w14:val="none"/>
-        </w:rPr>
-        <w:t>Legal and Institutional DRM Framework</w:t>
-      </w:r>
-    </w:p>
-    <w:p>
-      <w:pPr>
-        <w:spacing w:before="80" w:after="80"/>
-        <w:ind w:left="180"/>
-        <w:jc w:val="both"/>
-        <w:rPr>
-          <w:rFonts w:eastAsia="Times New Roman" w:cs="Times New Roman"/>
-          <w:b/>
-          <w:bCs/>
-          <w:color w:val="000000"/>
-          <w:kern w:val="0"/>
-          <w:lang w:bidi="ar-SA"/>
-          <w14:ligatures w14:val="none"/>
-        </w:rPr>
-      </w:pPr>
-      <w:r>
-        <w:rPr>
-          <w:rFonts w:eastAsia="Times New Roman" w:cs="Times New Roman"/>
-          <w:b/>
-          <w:bCs/>
-          <w:color w:val="000000"/>
-          <w:kern w:val="0"/>
-          <w:lang w:bidi="ar-SA"/>
-          <w14:ligatures w14:val="none"/>
-        </w:rPr>
-        <w:t>1.1. DRM policies and institutions</w:t>
-      </w:r>
-    </w:p>
-    <w:p>
-      <w:pPr>
-        <w:pStyle w:val="ListParagraph"/>
-        <w:numPr>
-          <w:ilvl w:val="0"/>
-          <w:numId w:val="9"/>
-        </w:numPr>
-        <w:spacing w:before="80" w:after="80"/>
-        <w:ind w:left="720"/>
-        <w:contextualSpacing w:val="0"/>
-        <w:jc w:val="both"/>
-        <w:rPr/>
-      </w:pPr>
-      <w:r>
-        <w:rPr/>
-        <w:t>Is there a legal framework (e.g., a DRM law or other legally-binding instruments) defining distinct responsibilities for disaster risk reduction and emergency management?</w:t>
-      </w:r>
-    </w:p>
-    <w:p>
-      <w:pPr>
-        <w:pStyle w:val="ListParagraph"/>
-        <w:numPr>
-          <w:ilvl w:val="0"/>
-          <w:numId w:val="9"/>
-        </w:numPr>
-        <w:spacing w:before="80" w:after="80"/>
-        <w:ind w:left="720"/>
-        <w:contextualSpacing w:val="0"/>
-        <w:jc w:val="both"/>
-        <w:rPr/>
-      </w:pPr>
-      <w:r>
-        <w:rPr/>
-        <w:t>Have any implementing decrees or regulations been approved since the adoption of the DRM legal framework? (e.g., rules on the structure or functions of the DRM agency or implementing regulations of the DRM law)</w:t>
-      </w:r>
-    </w:p>
-    <w:p>
-      <w:pPr>
-        <w:pStyle w:val="ListParagraph"/>
-        <w:numPr>
-          <w:ilvl w:val="0"/>
-          <w:numId w:val="9"/>
-        </w:numPr>
-        <w:spacing w:before="80" w:after="80"/>
-        <w:ind w:left="720"/>
-        <w:contextualSpacing w:val="0"/>
-        <w:jc w:val="both"/>
-        <w:rPr/>
-      </w:pPr>
-      <w:r>
-        <w:rPr/>
-        <w:t>In the last 4 years, have DRM policy instruments reflecting progress towards the objective laid out in the DRM legal framework been officially approved/updated? (e.g., DRM strategies or policies)</w:t>
-      </w:r>
-    </w:p>
-    <w:p>
-      <w:pPr>
-        <w:pStyle w:val="ListParagraph"/>
-        <w:numPr>
-          <w:ilvl w:val="0"/>
-          <w:numId w:val="9"/>
-        </w:numPr>
-        <w:spacing w:before="80" w:after="80"/>
-        <w:ind w:left="720"/>
-        <w:contextualSpacing w:val="0"/>
-        <w:jc w:val="both"/>
-        <w:rPr/>
-      </w:pPr>
-      <w:r>
-        <w:rPr/>
-        <w:t>Did the institution responsible for coordinating or leading DRM activities receive dedicated and significant funding for these functions in the last fiscal year?</w:t>
-      </w:r>
-    </w:p>
-    <w:p>
-      <w:pPr>
-        <w:spacing w:before="80" w:after="80"/>
-        <w:ind w:left="180"/>
-        <w:jc w:val="both"/>
-        <w:rPr>
-          <w:rFonts w:eastAsia="Times New Roman" w:cs="Times New Roman"/>
-          <w:b/>
-          <w:bCs/>
-          <w:color w:val="000000"/>
-          <w:kern w:val="0"/>
-          <w:lang w:bidi="ar-SA"/>
-          <w14:ligatures w14:val="none"/>
-        </w:rPr>
-      </w:pPr>
-      <w:r>
-        <w:rPr>
-          <w:rFonts w:eastAsia="Times New Roman" w:cs="Times New Roman"/>
-          <w:b w:val="1"/>
-          <w:bCs w:val="1"/>
-          <w:color w:val="000000"/>
-          <w:kern w:val="0"/>
-          <w:lang w:bidi="ar-SA"/>
-          <w14:ligatures w14:val="none"/>
-        </w:rPr>
-        <w:t>1.2. Mainstreaming DRM into national and sectoral development plans</w:t>
-      </w:r>
-    </w:p>
-    <w:p>
-      <w:pPr>
-        <w:pStyle w:val="ListParagraph"/>
-        <w:numPr>
-          <w:ilvl w:val="0"/>
-          <w:numId w:val="9"/>
-        </w:numPr>
-        <w:spacing w:before="80" w:after="80"/>
-        <w:ind w:left="720"/>
-        <w:contextualSpacing w:val="0"/>
-        <w:jc w:val="both"/>
-        <w:rPr/>
-      </w:pPr>
-      <w:r>
-        <w:rPr/>
-        <w:t>Does the National Development Strategy (or equivalent national planning instrument) contain objectives, targets or indicators related to DRM / DRR?</w:t>
-      </w:r>
-    </w:p>
-    <w:p>
-      <w:pPr>
-        <w:pStyle w:val="ListParagraph"/>
-        <w:numPr>
-          <w:ilvl w:val="0"/>
-          <w:numId w:val="9"/>
-        </w:numPr>
-        <w:spacing w:before="80" w:after="80"/>
-        <w:ind w:left="720"/>
-        <w:contextualSpacing w:val="0"/>
-        <w:jc w:val="both"/>
-        <w:rPr/>
-      </w:pPr>
-      <w:r>
-        <w:rPr/>
-        <w:t xml:space="preserve">Have at least </w:t>
-      </w:r>
-      <w:r>
-        <w:rPr/>
-        <w:t>4</w:t>
-      </w:r>
-      <w:r>
-        <w:rPr/>
-        <w:t xml:space="preserve"> essential government entities</w:t>
-      </w:r>
-      <w:r>
-        <w:rPr>
-          <w:rStyle w:val="FootnoteReference"/>
-        </w:rPr>
-        <w:footnoteReference w:id="5"/>
-      </w:r>
-      <w:r>
-        <w:rPr/>
-        <w:t xml:space="preserve"> included explicit DRM </w:t>
-      </w:r>
-      <w:r>
-        <w:rPr/>
-        <w:t xml:space="preserve">/ DRR</w:t>
-      </w:r>
-      <w:r>
-        <w:rPr/>
-        <w:t xml:space="preserve"> targets and indicators in their most recent strategic planning </w:t>
-      </w:r>
-      <w:r>
-        <w:rPr/>
-        <w:t xml:space="preserve">documents?</w:t>
-      </w:r>
-      <w:r>
-        <w:rPr/>
-        <w:t xml:space="preserve"> </w:t>
-      </w:r>
-      <w:r>
-        <w:rPr/>
-        <w:t>(e.g., Ministry of Health Strategic Plan, National Education Strategy/Policy, National Water and Sanitation Master Plan, Transport Infrastructure Development Plan)</w:t>
-      </w:r>
-    </w:p>
-    <w:p>
-      <w:pPr>
-        <w:pStyle w:val="ListParagraph"/>
-        <w:numPr>
-          <w:ilvl w:val="0"/>
-          <w:numId w:val="8"/>
-        </w:numPr>
-        <w:spacing w:before="80" w:after="80"/>
-        <w:contextualSpacing w:val="0"/>
-        <w:jc w:val="both"/>
-        <w:rPr>
-          <w:rFonts w:eastAsia="Times New Roman" w:cs="Times New Roman"/>
-          <w:b/>
-          <w:bCs/>
-          <w:color w:val="000000"/>
-          <w:kern w:val="0"/>
-          <w:u w:val="single"/>
-          <w:lang w:bidi="ar-SA"/>
-          <w14:ligatures w14:val="none"/>
-        </w:rPr>
-      </w:pPr>
-      <w:r>
-        <w:rPr>
-          <w:rFonts w:eastAsia="Times New Roman" w:cs="Times New Roman"/>
-          <w:b w:val="1"/>
-          <w:bCs w:val="1"/>
-          <w:color w:val="000000"/>
-          <w:kern w:val="0"/>
-          <w:u w:val="single"/>
-          <w:lang w:bidi="ar-SA"/>
-          <w14:ligatures w14:val="none"/>
-        </w:rPr>
-        <w:t>Risk Identification</w:t>
-      </w:r>
-    </w:p>
-    <w:p>
-      <w:pPr>
-        <w:pStyle w:val="ListParagraph"/>
-        <w:numPr>
-          <w:ilvl w:val="0"/>
-          <w:numId w:val="9"/>
-        </w:numPr>
-        <w:spacing w:before="80" w:after="80"/>
-        <w:ind w:left="720"/>
-        <w:contextualSpacing w:val="0"/>
-        <w:jc w:val="both"/>
-        <w:rPr/>
-      </w:pPr>
-      <w:r>
-        <w:rPr/>
-        <w:t>Do laws and regulations clearly define institutional responsibilities and mandates for producing, acquiring, and managing geospatial information, including risk information (e.g., hazard information, vulnerability assessments, risk profiles, historical disaster databases)?</w:t>
-      </w:r>
-    </w:p>
-    <w:p>
-      <w:pPr>
-        <w:pStyle w:val="ListParagraph"/>
-        <w:numPr>
-          <w:ilvl w:val="0"/>
-          <w:numId w:val="9"/>
-        </w:numPr>
-        <w:spacing w:before="80" w:after="80"/>
-        <w:ind w:left="720"/>
-        <w:contextualSpacing w:val="0"/>
-        <w:jc w:val="both"/>
-        <w:rPr/>
-      </w:pPr>
-      <w:r>
-        <w:rPr/>
-        <w:t>Is existing hazard and risk information accessible to government entities and citizens (e.g., through open-data platforms, risk atlases)?</w:t>
-      </w:r>
-    </w:p>
-    <w:p>
-      <w:pPr>
-        <w:pStyle w:val="ListParagraph"/>
-        <w:numPr>
-          <w:ilvl w:val="0"/>
-          <w:numId w:val="9"/>
-        </w:numPr>
-        <w:spacing w:before="80" w:after="80"/>
-        <w:ind w:left="720"/>
-        <w:contextualSpacing w:val="0"/>
-        <w:jc w:val="both"/>
-        <w:rPr/>
-      </w:pPr>
-      <w:r>
-        <w:rPr/>
-        <w:t>Is there any formal exchange mechanism between technical entities in charge of hazard/risk assessments and government entities that use this information? (e.g., evidenced through Memorandums of Understanding or cooperation agreements)</w:t>
-      </w:r>
-    </w:p>
-    <w:p>
-      <w:pPr>
-        <w:pStyle w:val="ListParagraph"/>
-        <w:numPr>
-          <w:ilvl w:val="0"/>
-          <w:numId w:val="9"/>
-        </w:numPr>
-        <w:spacing w:before="80" w:after="80"/>
-        <w:ind w:left="720"/>
-        <w:contextualSpacing w:val="0"/>
-        <w:jc w:val="both"/>
-        <w:rPr/>
-      </w:pPr>
-      <w:r>
-        <w:rPr/>
-        <w:t>Do available national risk assessments or disaster risk profiles account for the potential impacts of climate change on hazard intensity and frequency?</w:t>
-      </w:r>
-    </w:p>
-    <w:p>
-      <w:pPr>
-        <w:pStyle w:val="ListParagraph"/>
-        <w:numPr>
-          <w:ilvl w:val="0"/>
-          <w:numId w:val="8"/>
-        </w:numPr>
-        <w:spacing w:before="80" w:after="80"/>
-        <w:contextualSpacing w:val="0"/>
-        <w:jc w:val="both"/>
-        <w:rPr>
-          <w:rFonts w:eastAsia="Times New Roman" w:cs="Times New Roman"/>
-          <w:b/>
-          <w:bCs/>
-          <w:color w:val="000000"/>
-          <w:kern w:val="0"/>
-          <w:u w:val="single"/>
-          <w:lang w:bidi="ar-SA"/>
-          <w14:ligatures w14:val="none"/>
-        </w:rPr>
-      </w:pPr>
-      <w:r>
-        <w:rPr>
-          <w:rFonts w:eastAsia="Times New Roman" w:cs="Times New Roman"/>
-          <w:b/>
-          <w:bCs/>
-          <w:color w:val="000000"/>
-          <w:kern w:val="0"/>
-          <w:u w:val="single"/>
-          <w:lang w:bidi="ar-SA"/>
-          <w14:ligatures w14:val="none"/>
-        </w:rPr>
-        <w:t>Risk Reduction</w:t>
-      </w:r>
-    </w:p>
-    <w:p>
-      <w:pPr>
-        <w:spacing w:before="80" w:after="80"/>
-        <w:ind w:left="180"/>
-        <w:jc w:val="both"/>
-        <w:rPr>
-          <w:rFonts w:eastAsia="Times New Roman" w:cs="Times New Roman"/>
-          <w:b/>
-          <w:bCs/>
-          <w:color w:val="000000"/>
-          <w:kern w:val="0"/>
-          <w:lang w:bidi="ar-SA"/>
-          <w14:ligatures w14:val="none"/>
-        </w:rPr>
-      </w:pPr>
-      <w:r>
-        <w:rPr>
-          <w:rFonts w:eastAsia="Times New Roman" w:cs="Times New Roman"/>
-          <w:b w:val="1"/>
-          <w:bCs w:val="1"/>
-          <w:color w:val="000000"/>
-          <w:kern w:val="0"/>
-          <w:lang w:bidi="ar-SA"/>
-          <w14:ligatures w14:val="none"/>
-        </w:rPr>
-        <w:t xml:space="preserve">3.1. </w:t>
-      </w:r>
-      <w:r>
-        <w:rPr>
-          <w:rFonts w:eastAsia="Times New Roman" w:cs="Times New Roman"/>
-          <w:b w:val="1"/>
-          <w:bCs w:val="1"/>
-          <w:color w:val="000000"/>
-          <w:kern w:val="0"/>
-          <w:lang w:bidi="ar-SA"/>
-          <w14:ligatures w14:val="none"/>
-        </w:rPr>
-        <w:t>Territorial</w:t>
-      </w:r>
-      <w:r>
-        <w:rPr>
-          <w:rFonts w:eastAsia="Times New Roman" w:cs="Times New Roman"/>
-          <w:b w:val="1"/>
-          <w:bCs w:val="1"/>
-          <w:color w:val="000000"/>
-          <w:kern w:val="0"/>
-          <w:lang w:bidi="ar-SA"/>
-          <w14:ligatures w14:val="none"/>
-        </w:rPr>
-        <w:t xml:space="preserve"> and urban planning</w:t>
-      </w:r>
-    </w:p>
-    <w:p>
-      <w:pPr>
-        <w:pStyle w:val="ListParagraph"/>
-        <w:numPr>
-          <w:ilvl w:val="0"/>
-          <w:numId w:val="9"/>
-        </w:numPr>
-        <w:spacing w:before="80" w:after="80"/>
-        <w:ind w:left="720"/>
-        <w:contextualSpacing w:val="0"/>
-        <w:jc w:val="both"/>
-        <w:rPr/>
-      </w:pPr>
-      <w:r>
-        <w:rPr/>
-        <w:t>Do laws and regulations mandate the use of risk information (e.g., hazard maps, risk assessments) to develop territorial, spatial, land use, or urban planning instruments?</w:t>
-      </w:r>
-    </w:p>
-    <w:p>
-      <w:pPr>
-        <w:pStyle w:val="ListParagraph"/>
-        <w:numPr>
-          <w:ilvl w:val="0"/>
-          <w:numId w:val="9"/>
-        </w:numPr>
-        <w:spacing w:before="80" w:after="80"/>
-        <w:ind w:left="720"/>
-        <w:contextualSpacing w:val="0"/>
-        <w:jc w:val="both"/>
-        <w:rPr/>
-      </w:pPr>
-      <w:r>
-        <w:rPr/>
-        <w:t>Do official methodologies to guide the development of risk-informed territorial, spatial, land use or urban planning instruments exist?</w:t>
-      </w:r>
-    </w:p>
-    <w:p>
-      <w:pPr>
-        <w:pStyle w:val="ListParagraph"/>
-        <w:numPr>
-          <w:ilvl w:val="0"/>
-          <w:numId w:val="9"/>
-        </w:numPr>
-        <w:spacing w:before="80" w:after="80"/>
-        <w:ind w:left="720"/>
-        <w:contextualSpacing w:val="0"/>
-        <w:jc w:val="both"/>
-        <w:rPr/>
-      </w:pPr>
-      <w:r>
-        <w:rPr/>
-        <w:t>Do guidelines or procedures for managing housing/settlements located in high-risk areas exist?</w:t>
-      </w:r>
-    </w:p>
-    <w:p>
-      <w:pPr>
-        <w:pStyle w:val="ListParagraph"/>
-        <w:numPr>
-          <w:ilvl w:val="0"/>
-          <w:numId w:val="9"/>
-        </w:numPr>
-        <w:spacing w:before="80" w:after="80"/>
-        <w:ind w:left="720"/>
-        <w:contextualSpacing w:val="0"/>
-        <w:jc w:val="both"/>
-        <w:rPr/>
-      </w:pPr>
-      <w:r>
-        <w:rPr/>
-        <w:t>In the past 4 years, has risk information (e.g., hazard maps, risk assessments) consistently informed the elaboration of territorial, spatial, land use or urban planning instruments? (e.g., more than 50% of urban plans approved include risk considerations)</w:t>
-      </w:r>
-    </w:p>
-    <w:p>
-      <w:pPr>
-        <w:spacing w:before="80" w:after="80"/>
-        <w:ind w:left="180"/>
-        <w:jc w:val="both"/>
-        <w:rPr>
-          <w:rFonts w:eastAsia="Times New Roman" w:cs="Times New Roman"/>
-          <w:b/>
-          <w:bCs/>
-          <w:color w:val="000000"/>
-          <w:kern w:val="0"/>
-          <w:lang w:bidi="ar-SA"/>
-          <w14:ligatures w14:val="none"/>
-        </w:rPr>
-      </w:pPr>
-      <w:r>
-        <w:rPr>
-          <w:rFonts w:eastAsia="Times New Roman" w:cs="Times New Roman"/>
-          <w:b w:val="1"/>
-          <w:bCs w:val="1"/>
-          <w:color w:val="000000"/>
-          <w:kern w:val="0"/>
-          <w:lang w:bidi="ar-SA"/>
-          <w14:ligatures w14:val="none"/>
-        </w:rPr>
-        <w:t xml:space="preserve">3.2. Public </w:t>
-      </w:r>
-      <w:r>
-        <w:rPr>
-          <w:rFonts w:eastAsia="Times New Roman" w:cs="Times New Roman"/>
-          <w:b w:val="1"/>
-          <w:bCs w:val="1"/>
-          <w:color w:val="000000"/>
-          <w:kern w:val="0"/>
-          <w:lang w:bidi="ar-SA"/>
-          <w14:ligatures w14:val="none"/>
-        </w:rPr>
-        <w:t>investment</w:t>
-      </w:r>
-      <w:r>
-        <w:rPr>
-          <w:rFonts w:eastAsia="Times New Roman" w:cs="Times New Roman"/>
-          <w:b w:val="1"/>
-          <w:bCs w:val="1"/>
-          <w:color w:val="000000"/>
-          <w:kern w:val="0"/>
-          <w:lang w:bidi="ar-SA"/>
-          <w14:ligatures w14:val="none"/>
-        </w:rPr>
-        <w:t xml:space="preserve"> at the central level</w:t>
-      </w:r>
-    </w:p>
-    <w:p>
-      <w:pPr>
-        <w:pStyle w:val="ListParagraph"/>
-        <w:numPr>
-          <w:ilvl w:val="0"/>
-          <w:numId w:val="9"/>
-        </w:numPr>
-        <w:spacing w:before="80" w:after="80"/>
-        <w:ind w:left="720"/>
-        <w:contextualSpacing w:val="0"/>
-        <w:jc w:val="both"/>
-        <w:rPr/>
-      </w:pPr>
-      <w:r>
-        <w:rPr/>
-        <w:t>Do laws and regulations mandate disaster and climate risk screening as part of the appraisal of new public investment projects?</w:t>
-      </w:r>
-    </w:p>
-    <w:p>
-      <w:pPr>
-        <w:pStyle w:val="ListParagraph"/>
-        <w:numPr>
-          <w:ilvl w:val="0"/>
-          <w:numId w:val="9"/>
-        </w:numPr>
-        <w:spacing w:before="80" w:after="80"/>
-        <w:ind w:left="720"/>
-        <w:contextualSpacing w:val="0"/>
-        <w:jc w:val="both"/>
-        <w:rPr/>
-      </w:pPr>
-      <w:r>
-        <w:rPr/>
-        <w:t>Do official guidelines exist defining disaster and climate risk screening methodologies for new public investment projects?</w:t>
-      </w:r>
-    </w:p>
-    <w:p>
-      <w:pPr>
-        <w:pStyle w:val="ListParagraph"/>
-        <w:numPr>
-          <w:ilvl w:val="0"/>
-          <w:numId w:val="9"/>
-        </w:numPr>
-        <w:spacing w:before="80" w:after="80"/>
-        <w:ind w:left="720"/>
-        <w:contextualSpacing w:val="0"/>
-        <w:jc w:val="both"/>
-        <w:rPr/>
-      </w:pPr>
-      <w:r>
-        <w:rPr/>
-        <w:t>Are approved projects that have been identified as high-risk (or equivalent) through the disaster and climate screening process required to include risk mitigation measures?</w:t>
-      </w:r>
-    </w:p>
-    <w:p>
-      <w:pPr>
-        <w:spacing w:before="80" w:after="80"/>
-        <w:ind w:left="180"/>
-        <w:jc w:val="both"/>
-        <w:rPr>
-          <w:rFonts w:eastAsia="Times New Roman" w:cs="Times New Roman"/>
-          <w:b/>
-          <w:bCs/>
-          <w:color w:val="000000"/>
-          <w:kern w:val="0"/>
-          <w:lang w:bidi="ar-SA"/>
-          <w14:ligatures w14:val="none"/>
-        </w:rPr>
-      </w:pPr>
-      <w:r>
-        <w:rPr>
-          <w:rFonts w:eastAsia="Times New Roman" w:cs="Times New Roman"/>
-          <w:b/>
-          <w:bCs/>
-          <w:color w:val="000000"/>
-          <w:kern w:val="0"/>
-          <w:lang w:bidi="ar-SA"/>
-          <w14:ligatures w14:val="none"/>
-        </w:rPr>
-        <w:t>3.3. Sector-</w:t>
-      </w:r>
-      <w:r>
-        <w:rPr>
-          <w:rFonts w:eastAsia="Times New Roman" w:cs="Times New Roman"/>
-          <w:b/>
-          <w:bCs/>
-          <w:color w:val="000000"/>
-          <w:kern w:val="0"/>
-          <w:lang w:bidi="ar-SA"/>
-          <w14:ligatures w14:val="none"/>
-        </w:rPr>
-        <w:t>specific</w:t>
-      </w:r>
-      <w:r>
-        <w:rPr>
-          <w:rFonts w:eastAsia="Times New Roman" w:cs="Times New Roman"/>
-          <w:b/>
-          <w:bCs/>
-          <w:color w:val="000000"/>
-          <w:kern w:val="0"/>
-          <w:lang w:bidi="ar-SA"/>
-          <w14:ligatures w14:val="none"/>
-        </w:rPr>
-        <w:t xml:space="preserve"> risk reduction measures</w:t>
-      </w:r>
-    </w:p>
-    <w:p>
-      <w:pPr>
-        <w:pStyle w:val="ListParagraph"/>
-        <w:numPr>
-          <w:ilvl w:val="0"/>
-          <w:numId w:val="9"/>
-        </w:numPr>
-        <w:spacing w:before="80" w:after="80"/>
-        <w:ind w:left="720"/>
-        <w:contextualSpacing w:val="0"/>
-        <w:jc w:val="both"/>
-        <w:rPr/>
-      </w:pPr>
-      <w:r>
-        <w:rPr/>
-        <w:t>Are there legally binding standards or technical guidelines for the design and construction of disaster-resilient critical infrastructure in the following sectors: (1) transport (roads)</w:t>
-      </w:r>
-      <w:r>
-        <w:rPr/>
-        <w:t xml:space="preserve">, </w:t>
-      </w:r>
-      <w:r>
-        <w:rPr/>
-        <w:t>(2) education (schools)</w:t>
-      </w:r>
-      <w:r>
-        <w:rPr/>
-        <w:t xml:space="preserve">, </w:t>
-      </w:r>
-      <w:r>
-        <w:rPr/>
-        <w:t>(3) health (hospitals)</w:t>
-      </w:r>
-      <w:r>
-        <w:rPr/>
-        <w:t xml:space="preserve">, and </w:t>
-      </w:r>
-      <w:r>
-        <w:rPr/>
-        <w:t>(4) energy infrastructure?</w:t>
-      </w:r>
-    </w:p>
-    <w:p>
-      <w:pPr>
-        <w:pStyle w:val="ListParagraph"/>
-        <w:numPr>
-          <w:ilvl w:val="0"/>
-          <w:numId w:val="9"/>
-        </w:numPr>
-        <w:spacing w:before="80" w:after="80"/>
-        <w:ind w:left="720"/>
-        <w:contextualSpacing w:val="0"/>
-        <w:jc w:val="both"/>
-        <w:rPr/>
-      </w:pPr>
-      <w:r>
-        <w:rPr/>
-        <w:t>Is there at least one legally binding building code or standard that requires earthquake-resistant or other hazard-resistant (e.g., wind, flood) design for buildings?</w:t>
-      </w:r>
-    </w:p>
-    <w:p>
-      <w:pPr>
-        <w:pStyle w:val="ListParagraph"/>
-        <w:numPr>
-          <w:ilvl w:val="0"/>
-          <w:numId w:val="9"/>
-        </w:numPr>
-        <w:spacing w:before="80" w:after="80"/>
-        <w:ind w:left="720"/>
-        <w:contextualSpacing w:val="0"/>
-        <w:jc w:val="both"/>
-        <w:rPr/>
-      </w:pPr>
-      <w:r>
-        <w:rPr/>
-        <w:t>In the past 4 years, has any public project or program been allocated funding for retrofitting activities that follow vulnerability assessments and resilient design standards?</w:t>
-      </w:r>
-    </w:p>
-    <w:p>
-      <w:pPr>
-        <w:pStyle w:val="ListParagraph"/>
-        <w:numPr>
-          <w:ilvl w:val="0"/>
-          <w:numId w:val="9"/>
-        </w:numPr>
-        <w:spacing w:before="80" w:after="80"/>
-        <w:ind w:left="720"/>
-        <w:contextualSpacing w:val="0"/>
-        <w:jc w:val="both"/>
-        <w:rPr/>
-      </w:pPr>
-      <w:r>
-        <w:rPr/>
-        <w:t>Is there a legal framework for water supply and sanitation in urban areas that take flood risk into account?</w:t>
-      </w:r>
-    </w:p>
-    <w:p>
-      <w:pPr>
-        <w:pStyle w:val="ListParagraph"/>
-        <w:numPr>
-          <w:ilvl w:val="0"/>
-          <w:numId w:val="9"/>
-        </w:numPr>
-        <w:spacing w:before="80" w:after="80"/>
-        <w:ind w:left="720"/>
-        <w:contextualSpacing w:val="0"/>
-        <w:jc w:val="both"/>
-        <w:rPr/>
-      </w:pPr>
-      <w:r>
-        <w:rPr/>
-        <w:t>Is there a water governance framework that includes a coordination mechanism gathering the main actors in charge of Integrated Water Resources Management (e.g., water, agriculture, urban planning, energy)?</w:t>
-      </w:r>
-    </w:p>
-    <w:p>
-      <w:pPr>
-        <w:pStyle w:val="ListParagraph"/>
-        <w:numPr>
-          <w:ilvl w:val="0"/>
-          <w:numId w:val="9"/>
-        </w:numPr>
-        <w:spacing w:before="80" w:after="80"/>
-        <w:ind w:left="720"/>
-        <w:contextualSpacing w:val="0"/>
-        <w:jc w:val="both"/>
-        <w:rPr/>
-      </w:pPr>
-      <w:r>
-        <w:rPr/>
-        <w:t>Have any watershed basins undergone improvements in water management in the last four years?</w:t>
-      </w:r>
-    </w:p>
-    <w:p>
-      <w:pPr>
-        <w:pStyle w:val="ListParagraph"/>
-        <w:numPr>
-          <w:ilvl w:val="0"/>
-          <w:numId w:val="8"/>
-        </w:numPr>
-        <w:spacing w:before="80" w:after="80"/>
-        <w:contextualSpacing w:val="0"/>
-        <w:jc w:val="both"/>
-        <w:rPr>
-          <w:rFonts w:eastAsia="Times New Roman" w:cs="Times New Roman"/>
-          <w:b/>
-          <w:bCs/>
-          <w:color w:val="000000"/>
-          <w:kern w:val="0"/>
-          <w:u w:val="single"/>
-          <w:lang w:bidi="ar-SA"/>
-          <w14:ligatures w14:val="none"/>
-        </w:rPr>
-      </w:pPr>
-      <w:r>
-        <w:rPr>
-          <w:rFonts w:eastAsia="Times New Roman" w:cs="Times New Roman"/>
-          <w:b/>
-          <w:bCs/>
-          <w:color w:val="000000"/>
-          <w:kern w:val="0"/>
-          <w:u w:val="single"/>
-          <w:lang w:bidi="ar-SA"/>
-          <w14:ligatures w14:val="none"/>
-        </w:rPr>
-        <w:t>P</w:t>
-      </w:r>
-      <w:r>
-        <w:rPr>
-          <w:rFonts w:eastAsia="Times New Roman" w:cs="Times New Roman"/>
-          <w:b/>
-          <w:bCs/>
-          <w:color w:val="000000"/>
-          <w:kern w:val="0"/>
-          <w:u w:val="single"/>
-          <w:lang w:bidi="ar-SA"/>
-          <w14:ligatures w14:val="none"/>
-        </w:rPr>
-        <w:t>reparedness</w:t>
-      </w:r>
-    </w:p>
-    <w:p>
-      <w:pPr>
-        <w:spacing w:before="80" w:after="80"/>
-        <w:ind w:left="180"/>
-        <w:jc w:val="both"/>
-        <w:rPr>
-          <w:rFonts w:eastAsia="Times New Roman" w:cs="Times New Roman"/>
-          <w:b/>
-          <w:bCs/>
-          <w:color w:val="000000"/>
-          <w:kern w:val="0"/>
-          <w:lang w:bidi="ar-SA"/>
-          <w14:ligatures w14:val="none"/>
-        </w:rPr>
-      </w:pPr>
-      <w:r>
-        <w:rPr>
-          <w:rFonts w:eastAsia="Times New Roman" w:cs="Times New Roman"/>
-          <w:b w:val="1"/>
-          <w:bCs w:val="1"/>
-          <w:color w:val="000000"/>
-          <w:kern w:val="0"/>
-          <w:lang w:bidi="ar-SA"/>
-          <w14:ligatures w14:val="none"/>
-        </w:rPr>
-        <w:t xml:space="preserve">4.1. Early Warning </w:t>
-      </w:r>
-      <w:r>
-        <w:rPr>
-          <w:rFonts w:eastAsia="Times New Roman" w:cs="Times New Roman"/>
-          <w:b w:val="1"/>
-          <w:bCs w:val="1"/>
-          <w:color w:val="000000"/>
-          <w:kern w:val="0"/>
-          <w:lang w:bidi="ar-SA"/>
-          <w14:ligatures w14:val="none"/>
-        </w:rPr>
-        <w:t>Systems</w:t>
-      </w:r>
-      <w:r>
-        <w:rPr>
-          <w:rFonts w:eastAsia="Times New Roman" w:cs="Times New Roman"/>
-          <w:b w:val="1"/>
-          <w:bCs w:val="1"/>
-          <w:color w:val="000000"/>
-          <w:kern w:val="0"/>
-          <w:lang w:bidi="ar-SA"/>
-          <w14:ligatures w14:val="none"/>
-        </w:rPr>
-        <w:t xml:space="preserve"> (EWS)</w:t>
-      </w:r>
-    </w:p>
-    <w:p>
-      <w:pPr>
-        <w:pStyle w:val="ListParagraph"/>
-        <w:numPr>
-          <w:ilvl w:val="0"/>
-          <w:numId w:val="9"/>
-        </w:numPr>
-        <w:spacing w:before="80" w:after="80"/>
-        <w:ind w:left="720"/>
-        <w:contextualSpacing w:val="0"/>
-        <w:jc w:val="both"/>
-        <w:rPr/>
-      </w:pPr>
-      <w:r>
-        <w:rPr/>
-        <w:t>Do institutions involved in EWS—data producers, decision-makers, and implementers of preparedness and response—operate under an established, functional coordination mechanism, evidenced by formal arrangements such as Memorandums of Understanding or regular coordination platform meetings?</w:t>
-      </w:r>
-    </w:p>
-    <w:p>
-      <w:pPr>
-        <w:pStyle w:val="ListParagraph"/>
-        <w:numPr>
-          <w:ilvl w:val="0"/>
-          <w:numId w:val="9"/>
-        </w:numPr>
-        <w:spacing w:before="80" w:after="80"/>
-        <w:ind w:left="720"/>
-        <w:contextualSpacing w:val="0"/>
-        <w:jc w:val="both"/>
-        <w:rPr/>
-      </w:pPr>
-      <w:r>
-        <w:rPr/>
-        <w:t>Over the most recent major disaster, was the population promptly alerted (e.g., via SMS or other tailored communication channels)?</w:t>
-      </w:r>
-    </w:p>
-    <w:p>
-      <w:pPr>
-        <w:pStyle w:val="ListParagraph"/>
-        <w:numPr>
-          <w:ilvl w:val="0"/>
-          <w:numId w:val="9"/>
-        </w:numPr>
-        <w:spacing w:before="80" w:after="80"/>
-        <w:ind w:left="720"/>
-        <w:contextualSpacing w:val="0"/>
-        <w:jc w:val="both"/>
-        <w:rPr/>
-      </w:pPr>
-      <w:r>
-        <w:rPr/>
-        <w:t>In the past 4 years, has there been a consistent budget allocation for the expansion, maintenance, and operation of the geophysical and/or hydrometeorological network?</w:t>
-      </w:r>
-    </w:p>
-    <w:p>
-      <w:pPr>
-        <w:spacing w:before="80" w:after="80"/>
-        <w:ind w:left="180"/>
-        <w:jc w:val="both"/>
-        <w:rPr>
-          <w:rFonts w:eastAsia="Times New Roman" w:cs="Times New Roman"/>
-          <w:b/>
-          <w:bCs/>
-          <w:color w:val="000000"/>
-          <w:kern w:val="0"/>
-          <w:lang w:bidi="ar-SA"/>
-          <w14:ligatures w14:val="none"/>
-        </w:rPr>
-      </w:pPr>
-      <w:r>
-        <w:rPr>
-          <w:rFonts w:eastAsia="Times New Roman" w:cs="Times New Roman"/>
-          <w:b w:val="1"/>
-          <w:bCs w:val="1"/>
-          <w:color w:val="000000"/>
-          <w:kern w:val="0"/>
-          <w:lang w:bidi="ar-SA"/>
-          <w14:ligatures w14:val="none"/>
-        </w:rPr>
-        <w:t xml:space="preserve">4.2. </w:t>
-      </w:r>
-      <w:r>
-        <w:rPr>
-          <w:rFonts w:eastAsia="Times New Roman" w:cs="Times New Roman"/>
-          <w:b w:val="1"/>
-          <w:bCs w:val="1"/>
-          <w:color w:val="000000"/>
-          <w:kern w:val="0"/>
-          <w:lang w:bidi="ar-SA"/>
-          <w14:ligatures w14:val="none"/>
-        </w:rPr>
-        <w:t>Emergency</w:t>
-      </w:r>
-      <w:r>
-        <w:rPr>
-          <w:rFonts w:eastAsia="Times New Roman" w:cs="Times New Roman"/>
-          <w:b w:val="1"/>
-          <w:bCs w:val="1"/>
-          <w:color w:val="000000"/>
-          <w:kern w:val="0"/>
-          <w:lang w:bidi="ar-SA"/>
-          <w14:ligatures w14:val="none"/>
-        </w:rPr>
-        <w:t xml:space="preserve"> Preparedness and Response (EP&amp;R)</w:t>
-      </w:r>
-    </w:p>
-    <w:p>
-      <w:pPr>
-        <w:pStyle w:val="ListParagraph"/>
-        <w:numPr>
-          <w:ilvl w:val="0"/>
-          <w:numId w:val="9"/>
-        </w:numPr>
-        <w:spacing w:before="80" w:after="80"/>
-        <w:ind w:left="720"/>
-        <w:contextualSpacing w:val="0"/>
-        <w:jc w:val="both"/>
-        <w:rPr/>
-      </w:pPr>
-      <w:r>
-        <w:rPr/>
-        <w:t>Is there a legal framework for EP&amp;R clearly defining the roles and responsibilities of institutions involved in disaster management?</w:t>
-      </w:r>
-    </w:p>
-    <w:p>
-      <w:pPr>
-        <w:pStyle w:val="ListParagraph"/>
-        <w:numPr>
-          <w:ilvl w:val="0"/>
-          <w:numId w:val="9"/>
-        </w:numPr>
-        <w:spacing w:before="80" w:after="80"/>
-        <w:ind w:left="720"/>
-        <w:contextualSpacing w:val="0"/>
-        <w:jc w:val="both"/>
-        <w:rPr/>
-      </w:pPr>
-      <w:r>
-        <w:rPr/>
-        <w:t>Is there a national contingency plan or national emergency plan with a clear distribution of roles and responsibilities among involved actors in emergency management?</w:t>
-      </w:r>
-    </w:p>
-    <w:p>
-      <w:pPr>
-        <w:pStyle w:val="ListParagraph"/>
-        <w:numPr>
-          <w:ilvl w:val="0"/>
-          <w:numId w:val="9"/>
-        </w:numPr>
-        <w:spacing w:before="80" w:after="80"/>
-        <w:ind w:left="720"/>
-        <w:contextualSpacing w:val="0"/>
-        <w:jc w:val="both"/>
-        <w:rPr/>
-      </w:pPr>
-      <w:r>
-        <w:rPr/>
-        <w:t>Do at least 50% of subnational EP&amp;R entities (e.g., Local Emergency Management Committee) have an approved contingency plan or emergency response protocol?</w:t>
-      </w:r>
-    </w:p>
-    <w:p>
-      <w:pPr>
-        <w:pStyle w:val="ListParagraph"/>
-        <w:numPr>
-          <w:ilvl w:val="0"/>
-          <w:numId w:val="9"/>
-        </w:numPr>
-        <w:spacing w:before="80" w:after="80"/>
-        <w:ind w:left="720"/>
-        <w:contextualSpacing w:val="0"/>
-        <w:jc w:val="both"/>
-        <w:rPr/>
-      </w:pPr>
-      <w:r>
-        <w:rPr/>
-        <w:t>Do emergency preparedness plans incorporate gender-sensitive measures, such as gender-based violence prevention, safe shelters, and women's specific needs during evacuation and displacement?</w:t>
-      </w:r>
-    </w:p>
-    <w:p>
-      <w:pPr>
-        <w:spacing w:before="80" w:after="80"/>
-        <w:ind w:left="180"/>
-        <w:jc w:val="both"/>
-        <w:rPr>
-          <w:rFonts w:eastAsia="Times New Roman" w:cs="Times New Roman"/>
-          <w:b/>
-          <w:bCs/>
-          <w:color w:val="000000"/>
-          <w:kern w:val="0"/>
-          <w:lang w:bidi="ar-SA"/>
-          <w14:ligatures w14:val="none"/>
-        </w:rPr>
-      </w:pPr>
-      <w:r>
-        <w:rPr>
-          <w:rFonts w:eastAsia="Times New Roman" w:cs="Times New Roman"/>
-          <w:b w:val="1"/>
-          <w:bCs w:val="1"/>
-          <w:color w:val="000000"/>
-          <w:kern w:val="0"/>
-          <w:lang w:bidi="ar-SA"/>
-          <w14:ligatures w14:val="none"/>
-        </w:rPr>
-        <w:t xml:space="preserve">4.3. </w:t>
-      </w:r>
-      <w:r>
-        <w:rPr>
-          <w:rFonts w:eastAsia="Times New Roman" w:cs="Times New Roman"/>
-          <w:b w:val="1"/>
-          <w:bCs w:val="1"/>
-          <w:color w:val="000000"/>
-          <w:kern w:val="0"/>
-          <w:lang w:bidi="ar-SA"/>
-          <w14:ligatures w14:val="none"/>
-        </w:rPr>
-        <w:t>Adaptive</w:t>
-      </w:r>
-      <w:r>
-        <w:rPr>
-          <w:rFonts w:eastAsia="Times New Roman" w:cs="Times New Roman"/>
-          <w:b w:val="1"/>
-          <w:bCs w:val="1"/>
-          <w:color w:val="000000"/>
-          <w:kern w:val="0"/>
-          <w:lang w:bidi="ar-SA"/>
-          <w14:ligatures w14:val="none"/>
-        </w:rPr>
-        <w:t xml:space="preserve"> Social Protection (ASP)</w:t>
-      </w:r>
-    </w:p>
-    <w:p>
-      <w:pPr>
-        <w:pStyle w:val="ListParagraph"/>
-        <w:numPr>
-          <w:ilvl w:val="0"/>
-          <w:numId w:val="9"/>
-        </w:numPr>
-        <w:spacing w:before="80" w:after="80"/>
-        <w:ind w:left="720"/>
-        <w:contextualSpacing w:val="0"/>
-        <w:jc w:val="both"/>
-        <w:rPr/>
-      </w:pPr>
-      <w:r>
-        <w:rPr/>
-        <w:t>Is there a legal framework clearly defining the roles and responsibilities of institutions involved in ASP (e.g., social protection, finance, DRM)?</w:t>
-      </w:r>
-    </w:p>
-    <w:p>
-      <w:pPr>
-        <w:pStyle w:val="ListParagraph"/>
-        <w:numPr>
-          <w:ilvl w:val="0"/>
-          <w:numId w:val="9"/>
-        </w:numPr>
-        <w:spacing w:before="80" w:after="80"/>
-        <w:ind w:left="720"/>
-        <w:contextualSpacing w:val="0"/>
-        <w:jc w:val="both"/>
-        <w:rPr/>
-      </w:pPr>
-      <w:r>
-        <w:rPr/>
-        <w:t>Is there a unified social registry incorporating exposure and vulnerability data to facilitate the targeting of population potentially affected in case of disaster or climate-related shocks?</w:t>
-      </w:r>
-    </w:p>
-    <w:p>
-      <w:pPr>
-        <w:pStyle w:val="ListParagraph"/>
-        <w:numPr>
-          <w:ilvl w:val="0"/>
-          <w:numId w:val="9"/>
-        </w:numPr>
-        <w:spacing w:before="80" w:after="80"/>
-        <w:ind w:left="720"/>
-        <w:contextualSpacing w:val="0"/>
-        <w:jc w:val="both"/>
-        <w:rPr/>
-      </w:pPr>
-      <w:r>
-        <w:rPr/>
-        <w:t>During the most recent disaster or climate-related shock, was support promptly provided to the population through social‐protection programs? (e.g., cash transfers in the case of flood/drought)?</w:t>
-      </w:r>
-    </w:p>
-    <w:p>
-      <w:pPr>
-        <w:pStyle w:val="ListParagraph"/>
-        <w:numPr>
-          <w:ilvl w:val="0"/>
-          <w:numId w:val="8"/>
-        </w:numPr>
-        <w:spacing w:before="80" w:after="80"/>
-        <w:contextualSpacing w:val="0"/>
-        <w:jc w:val="both"/>
-        <w:rPr>
-          <w:rFonts w:eastAsia="Times New Roman" w:cs="Times New Roman"/>
-          <w:b/>
-          <w:bCs/>
-          <w:color w:val="000000"/>
-          <w:kern w:val="0"/>
-          <w:u w:val="single"/>
-          <w:lang w:bidi="ar-SA"/>
-          <w14:ligatures w14:val="none"/>
-        </w:rPr>
-      </w:pPr>
-      <w:r>
-        <w:rPr>
-          <w:rFonts w:eastAsia="Times New Roman" w:cs="Times New Roman"/>
-          <w:b/>
-          <w:bCs/>
-          <w:color w:val="000000"/>
-          <w:kern w:val="0"/>
-          <w:u w:val="single"/>
-          <w:lang w:bidi="ar-SA"/>
-          <w14:ligatures w14:val="none"/>
-        </w:rPr>
-        <w:t>Financial Protection</w:t>
-      </w:r>
-    </w:p>
-    <w:p>
-      <w:pPr>
-        <w:spacing w:before="80" w:after="80"/>
-        <w:ind w:left="180"/>
-        <w:jc w:val="both"/>
-        <w:rPr>
-          <w:rFonts w:eastAsia="Times New Roman" w:cs="Times New Roman"/>
-          <w:b/>
-          <w:bCs/>
-          <w:color w:val="000000"/>
-          <w:kern w:val="0"/>
-          <w:lang w:bidi="ar-SA"/>
-          <w14:ligatures w14:val="none"/>
-        </w:rPr>
-      </w:pPr>
-      <w:r>
-        <w:rPr>
-          <w:rFonts w:eastAsia="Times New Roman" w:cs="Times New Roman"/>
-          <w:b w:val="1"/>
-          <w:bCs w:val="1"/>
-          <w:color w:val="000000"/>
-          <w:kern w:val="0"/>
-          <w:lang w:bidi="ar-SA"/>
-          <w14:ligatures w14:val="none"/>
-        </w:rPr>
-        <w:t xml:space="preserve">5.1. </w:t>
-      </w:r>
-      <w:r>
-        <w:rPr>
-          <w:rFonts w:eastAsia="Times New Roman" w:cs="Times New Roman"/>
-          <w:b w:val="1"/>
-          <w:bCs w:val="1"/>
-          <w:color w:val="000000"/>
-          <w:kern w:val="0"/>
-          <w:lang w:bidi="ar-SA"/>
-          <w14:ligatures w14:val="none"/>
-        </w:rPr>
-        <w:t>Fiscal</w:t>
-      </w:r>
-      <w:r>
-        <w:rPr>
-          <w:rFonts w:eastAsia="Times New Roman" w:cs="Times New Roman"/>
-          <w:b w:val="1"/>
-          <w:bCs w:val="1"/>
-          <w:color w:val="000000"/>
-          <w:kern w:val="0"/>
-          <w:lang w:bidi="ar-SA"/>
-          <w14:ligatures w14:val="none"/>
-        </w:rPr>
-        <w:t xml:space="preserve"> risk management</w:t>
-      </w:r>
-    </w:p>
-    <w:p>
-      <w:pPr>
-        <w:pStyle w:val="ListParagraph"/>
-        <w:numPr>
-          <w:ilvl w:val="0"/>
-          <w:numId w:val="9"/>
-        </w:numPr>
-        <w:spacing w:before="80" w:after="80"/>
-        <w:ind w:left="720"/>
-        <w:contextualSpacing w:val="0"/>
-        <w:jc w:val="both"/>
-        <w:rPr/>
-      </w:pPr>
-      <w:r>
-        <w:rPr/>
-        <w:t>Has the Ministry of Finance created or tasked an existing institutional structure (e.g., department, unit, committee) to manage contingent liabilities and/or fiscal risks, explicitly including those associated with disasters and/or climate-related shocks?</w:t>
-      </w:r>
-    </w:p>
-    <w:p>
-      <w:pPr>
-        <w:pStyle w:val="ListParagraph"/>
-        <w:numPr>
-          <w:ilvl w:val="0"/>
-          <w:numId w:val="9"/>
-        </w:numPr>
-        <w:spacing w:before="80" w:after="80"/>
-        <w:ind w:left="720"/>
-        <w:contextualSpacing w:val="0"/>
-        <w:jc w:val="both"/>
-        <w:rPr/>
-      </w:pPr>
-      <w:r>
-        <w:rPr/>
-        <w:t>Are contingent liabilities associated with disasters quantified through an established methodology for the major hazards?</w:t>
-      </w:r>
-    </w:p>
-    <w:p>
-      <w:pPr>
-        <w:pStyle w:val="ListParagraph"/>
-        <w:numPr>
-          <w:ilvl w:val="0"/>
-          <w:numId w:val="9"/>
-        </w:numPr>
-        <w:spacing w:before="80" w:after="80"/>
-        <w:ind w:left="720"/>
-        <w:contextualSpacing w:val="0"/>
-        <w:jc w:val="both"/>
-        <w:rPr/>
-      </w:pPr>
-      <w:r>
-        <w:rPr/>
-        <w:t>Do key fiscal policy documents (e.g., the medium-term fiscal framework or fiscal risk statements) include quantified assessments of disaster risks?</w:t>
-      </w:r>
-    </w:p>
-    <w:p>
-      <w:pPr>
-        <w:pStyle w:val="ListParagraph"/>
-        <w:numPr>
-          <w:ilvl w:val="0"/>
-          <w:numId w:val="9"/>
-        </w:numPr>
-        <w:spacing w:before="80" w:after="80"/>
-        <w:ind w:left="720"/>
-        <w:contextualSpacing w:val="0"/>
-        <w:jc w:val="both"/>
-        <w:rPr/>
-      </w:pPr>
-      <w:r>
-        <w:rPr/>
-        <w:t>Has the government conducted stress tests of public debt that include disaster or climate-related scenarios?</w:t>
-      </w:r>
-    </w:p>
-    <w:p>
-      <w:pPr>
-        <w:spacing w:before="80" w:after="80"/>
-        <w:ind w:left="180"/>
-        <w:jc w:val="both"/>
-        <w:rPr>
-          <w:rFonts w:eastAsia="Times New Roman" w:cs="Times New Roman"/>
-          <w:b/>
-          <w:bCs/>
-          <w:color w:val="000000"/>
-          <w:kern w:val="0"/>
-          <w:lang w:bidi="ar-SA"/>
-          <w14:ligatures w14:val="none"/>
-        </w:rPr>
-      </w:pPr>
-      <w:r>
-        <w:rPr>
-          <w:rFonts w:eastAsia="Times New Roman" w:cs="Times New Roman"/>
-          <w:b w:val="1"/>
-          <w:bCs w:val="1"/>
-          <w:color w:val="000000"/>
-          <w:kern w:val="0"/>
-          <w:lang w:bidi="ar-SA"/>
-          <w14:ligatures w14:val="none"/>
-        </w:rPr>
-        <w:t xml:space="preserve">5.2. Disaster Risk </w:t>
-      </w:r>
-      <w:r>
-        <w:rPr>
-          <w:rFonts w:eastAsia="Times New Roman" w:cs="Times New Roman"/>
-          <w:b w:val="1"/>
-          <w:bCs w:val="1"/>
-          <w:color w:val="000000"/>
-          <w:kern w:val="0"/>
-          <w:lang w:bidi="ar-SA"/>
-          <w14:ligatures w14:val="none"/>
-        </w:rPr>
-        <w:t>Financing</w:t>
-      </w:r>
-      <w:r>
-        <w:rPr>
-          <w:rFonts w:eastAsia="Times New Roman" w:cs="Times New Roman"/>
-          <w:b w:val="1"/>
-          <w:bCs w:val="1"/>
-          <w:color w:val="000000"/>
-          <w:kern w:val="0"/>
-          <w:lang w:bidi="ar-SA"/>
-          <w14:ligatures w14:val="none"/>
-        </w:rPr>
-        <w:t xml:space="preserve"> (DRF) strategies and instruments</w:t>
-      </w:r>
-    </w:p>
-    <w:p>
-      <w:pPr>
-        <w:pStyle w:val="ListParagraph"/>
-        <w:numPr>
-          <w:ilvl w:val="0"/>
-          <w:numId w:val="9"/>
-        </w:numPr>
-        <w:spacing w:before="80" w:after="80"/>
-        <w:ind w:left="720"/>
-        <w:contextualSpacing w:val="0"/>
-        <w:jc w:val="both"/>
-        <w:rPr/>
-      </w:pPr>
-      <w:r>
-        <w:rPr/>
-        <w:t>Are there sovereign risk financing instruments (e.g., disaster or emergency funds, contingent loans, insurance, cat bonds) in place to manage the financial impact of disasters and climate-related shocks?</w:t>
-      </w:r>
-    </w:p>
-    <w:p>
-      <w:pPr>
-        <w:pStyle w:val="ListParagraph"/>
-        <w:numPr>
-          <w:ilvl w:val="0"/>
-          <w:numId w:val="9"/>
-        </w:numPr>
-        <w:spacing w:before="80" w:after="80"/>
-        <w:ind w:left="720"/>
-        <w:contextualSpacing w:val="0"/>
-        <w:jc w:val="both"/>
-        <w:rPr/>
-      </w:pPr>
-      <w:r>
-        <w:rPr/>
-        <w:t>Are there regulations that define standards for catastrophe insurance coverage of public or private assets?</w:t>
-      </w:r>
-    </w:p>
-    <w:p>
-      <w:pPr>
-        <w:pStyle w:val="ListParagraph"/>
-        <w:numPr>
-          <w:ilvl w:val="0"/>
-          <w:numId w:val="9"/>
-        </w:numPr>
-        <w:spacing w:before="80" w:after="80"/>
-        <w:ind w:left="720"/>
-        <w:contextualSpacing w:val="0"/>
-        <w:jc w:val="both"/>
-        <w:rPr/>
-      </w:pPr>
-      <w:r>
-        <w:rPr/>
-        <w:t>In the past 4 years, has the $ amount of financing that can be mobilized through sovereign risk financing instruments increased?</w:t>
-      </w:r>
-    </w:p>
-    <w:p>
-      <w:pPr>
-        <w:pStyle w:val="ListParagraph"/>
-        <w:numPr>
-          <w:ilvl w:val="0"/>
-          <w:numId w:val="8"/>
-        </w:numPr>
-        <w:spacing w:before="80" w:after="80"/>
-        <w:contextualSpacing w:val="0"/>
-        <w:jc w:val="both"/>
-        <w:rPr>
-          <w:rFonts w:eastAsia="Times New Roman" w:cs="Times New Roman"/>
-          <w:b/>
-          <w:bCs/>
-          <w:color w:val="000000"/>
-          <w:kern w:val="0"/>
-          <w:u w:val="single"/>
-          <w:lang w:bidi="ar-SA"/>
-          <w14:ligatures w14:val="none"/>
-        </w:rPr>
-      </w:pPr>
-      <w:r>
-        <w:rPr>
-          <w:rFonts w:eastAsia="Times New Roman" w:cs="Times New Roman"/>
-          <w:b w:val="1"/>
-          <w:bCs w:val="1"/>
-          <w:color w:val="000000"/>
-          <w:kern w:val="0"/>
-          <w:u w:val="single"/>
-          <w:lang w:bidi="ar-SA"/>
-          <w14:ligatures w14:val="none"/>
-        </w:rPr>
-        <w:t>Resilient Reconstruction</w:t>
-      </w:r>
-    </w:p>
-    <w:p>
-      <w:pPr>
-        <w:pStyle w:val="ListParagraph"/>
-        <w:numPr>
-          <w:ilvl w:val="0"/>
-          <w:numId w:val="9"/>
-        </w:numPr>
-        <w:spacing w:before="80" w:after="80"/>
-        <w:ind w:left="720"/>
-        <w:contextualSpacing w:val="0"/>
-        <w:jc w:val="both"/>
-        <w:rPr/>
-      </w:pPr>
-      <w:r>
-        <w:rPr/>
-        <w:t>Are there laws or regulations that establish the institutions responsible for coordinating post-disaster recovery and reconstruction?</w:t>
-      </w:r>
-    </w:p>
-    <w:p>
-      <w:pPr>
-        <w:pStyle w:val="ListParagraph"/>
-        <w:numPr>
-          <w:ilvl w:val="0"/>
-          <w:numId w:val="9"/>
-        </w:numPr>
-        <w:spacing w:before="80" w:after="80"/>
-        <w:ind w:left="720"/>
-        <w:contextualSpacing w:val="0"/>
-        <w:jc w:val="both"/>
-        <w:rPr/>
-      </w:pPr>
-      <w:r>
-        <w:rPr/>
-        <w:t>Has the government approved methodologies, guidelines, or regulations to evaluate damages following a disaster?</w:t>
-      </w:r>
-    </w:p>
-    <w:p>
-      <w:pPr>
-        <w:pStyle w:val="ListParagraph"/>
-        <w:numPr>
-          <w:ilvl w:val="0"/>
-          <w:numId w:val="9"/>
-        </w:numPr>
-        <w:spacing w:before="80" w:after="0"/>
-        <w:ind w:left="720"/>
-        <w:contextualSpacing w:val="0"/>
-        <w:jc w:val="both"/>
-        <w:rPr/>
-      </w:pPr>
-      <w:r>
-        <w:rPr/>
-        <w:t xml:space="preserve">After a recent major disaster, </w:t>
-      </w:r>
-      <w:r>
-        <w:rPr/>
-        <w:t>has</w:t>
-      </w:r>
-      <w:r>
-        <w:rPr/>
-        <w:t xml:space="preserve"> any zoning, land use or territorial planning instrument in the affected areas been reviewed with the </w:t>
-      </w:r>
-      <w:r>
-        <w:rPr/>
-        <w:t>objective</w:t>
-      </w:r>
-      <w:r>
-        <w:rPr/>
-        <w:t xml:space="preserve"> of reducing risk?</w:t>
+        <w:rPr/>
+        <w:t xml:space="preserve">. Countries face diverse risk profiles and </w:t>
+      </w:r>
+      <w:r>
+        <w:rPr/>
+        <w:t>operate</w:t>
+      </w:r>
+      <w:r>
+        <w:rPr/>
+        <w:t xml:space="preserve"> within distinct legislative and institutional environments in which their DRM systems must evolve. In lower-capacity settings, specific thematic areas may fall into the nascent category not because reforms are weak or insignificant, but because DRM systems </w:t>
+      </w:r>
+      <w:r>
+        <w:rPr/>
+        <w:t>remain</w:t>
+      </w:r>
+      <w:r>
+        <w:rPr/>
+        <w:t xml:space="preserve"> at an early stage of development and are not yet producing the outputs captured by the binary questions. Conversely, countries with long-standing DRM systems may be delivering some of the targeted outputs even where the underlying legal and regulatory framework </w:t>
+      </w:r>
+      <w:r>
+        <w:rPr/>
+        <w:t>remains</w:t>
+      </w:r>
+      <w:r>
+        <w:rPr/>
+        <w:t xml:space="preserve"> comparatively weak.</w:t>
       </w:r>
     </w:p>
     <w:sectPr>
@@ -4932,6 +3348,7 @@
     <w:p>
       <w:pPr>
         <w:pStyle w:val="FootnoteText"/>
+        <w:spacing w:line="240" w:lineRule="auto"/>
         <w:jc w:val="both"/>
         <w:rPr>
           <w:rFonts w:ascii="Aptos" w:hAnsi="Aptos" w:eastAsia="Aptos" w:cs="Aptos"/>
@@ -4944,21 +3361,23 @@
         <w:footnoteRef/>
       </w:r>
       <w:r>
+        <w:rPr/>
         <w:t xml:space="preserve"> T</w:t>
       </w:r>
       <w:r>
         <w:rPr>
-          <w:rFonts w:eastAsiaTheme="minorEastAsia"/>
+          <w:rFonts w:eastAsia="游ゴシック" w:eastAsiaTheme="minorEastAsia"/>
         </w:rPr>
         <w:t>he design of this idealized framework has been informed by a comprehensive review of DRM policy programs supported through Development Policy Financing (DPF) with Catastrophe Deferred Drawdown Options (Cat DDOs).</w:t>
       </w:r>
       <w:r>
         <w:rPr>
-          <w:rFonts w:eastAsiaTheme="minorEastAsia"/>
+          <w:rFonts w:eastAsia="游ゴシック" w:eastAsiaTheme="minorEastAsia"/>
         </w:rPr>
         <w:t xml:space="preserve"> It is </w:t>
       </w:r>
       <w:r>
+        <w:rPr/>
         <w:t xml:space="preserve">aligned with established DRM frameworks, including the IDB’s IGOPP and the Sendai Framework. The design of this benchmark also draws on core concepts from the </w:t>
       </w:r>
       <w:r>
@@ -4968,16 +3387,18 @@
         <w:t xml:space="preserve">public administration and governance literature to determine whether policy commitments are coherently designed, operationally resourced, and systematically enforced and refined over time (see </w:t>
       </w:r>
       <w:r>
+        <w:rPr/>
         <w:t xml:space="preserve">Peters, B. G. (2010). </w:t>
       </w:r>
       <w:r>
         <w:rPr>
-          <w:i/>
-          <w:iCs/>
+          <w:i w:val="1"/>
+          <w:iCs w:val="1"/>
         </w:rPr>
         <w:t>The Politics of Bureaucracy</w:t>
       </w:r>
       <w:r>
+        <w:rPr/>
         <w:t>. Routledge</w:t>
       </w:r>
       <w:r>
@@ -4998,6 +3419,7 @@
     <w:p>
       <w:pPr>
         <w:pStyle w:val="FootnoteText"/>
+        <w:spacing w:line="240" w:lineRule="auto"/>
         <w:jc w:val="both"/>
         <w:rPr>
           <w:sz w:val="18"/>
@@ -5011,40 +3433,43 @@
         <w:footnoteRef/>
       </w:r>
       <w:r>
+        <w:rPr/>
         <w:t xml:space="preserve"> Disaster risk is highly context-specific, and the diagnostic provided by this tool is only an initial step toward developing an appropriate and effective DRM policy program. For more details, the reader i</w:t>
       </w:r>
       <w:r>
         <w:rPr>
-          <w:rFonts w:eastAsiaTheme="minorEastAsia"/>
+          <w:rFonts w:eastAsia="游ゴシック" w:eastAsiaTheme="minorEastAsia"/>
         </w:rPr>
         <w:t xml:space="preserve">s referred to the </w:t>
       </w:r>
       <w:r>
         <w:rPr>
-          <w:rFonts w:eastAsiaTheme="minorEastAsia"/>
-          <w:i/>
-          <w:iCs/>
+          <w:rFonts w:eastAsia="游ゴシック" w:eastAsiaTheme="minorEastAsia"/>
+          <w:i w:val="1"/>
+          <w:iCs w:val="1"/>
         </w:rPr>
         <w:t xml:space="preserve">Driving Policy Reform for Disaster Resilience </w:t>
       </w:r>
-      <w:hyperlink r:id="rId1">
+      <w:hyperlink r:id="Rd79af251a1924f8b">
         <w:r>
           <w:rPr>
             <w:rStyle w:val="Hyperlink"/>
-            <w:rFonts w:eastAsiaTheme="minorEastAsia"/>
+            <w:rFonts w:eastAsia="游ゴシック" w:eastAsiaTheme="minorEastAsia"/>
           </w:rPr>
           <w:t>report</w:t>
         </w:r>
       </w:hyperlink>
       <w:r>
+        <w:rPr/>
         <w:t xml:space="preserve"> </w:t>
       </w:r>
       <w:r>
+        <w:rPr/>
         <w:t>for further guidance on how to structure a context-relevant DRM policy program</w:t>
       </w:r>
       <w:r>
         <w:rPr>
-          <w:rFonts w:eastAsiaTheme="minorEastAsia"/>
+          <w:rFonts w:eastAsia="游ゴシック" w:eastAsiaTheme="minorEastAsia"/>
         </w:rPr>
         <w:t>.</w:t>
       </w:r>
@@ -5054,9 +3479,10 @@
     <w:p>
       <w:pPr>
         <w:pStyle w:val="FootnoteText"/>
+        <w:spacing w:line="240" w:lineRule="auto"/>
         <w:jc w:val="both"/>
         <w:rPr>
-          <w:rFonts w:eastAsiaTheme="minorEastAsia"/>
+          <w:rFonts w:eastAsia="游ゴシック" w:eastAsiaTheme="minorEastAsia"/>
         </w:rPr>
       </w:pPr>
       <w:r>
@@ -5066,16 +3492,18 @@
         <w:footnoteRef/>
       </w:r>
       <w:r>
+        <w:rPr/>
         <w:t xml:space="preserve"> Drawing on country experiences and global good practices, this framework was first proposed in </w:t>
       </w:r>
       <w:r>
         <w:rPr>
-          <w:i/>
-          <w:iCs/>
+          <w:i w:val="1"/>
+          <w:iCs w:val="1"/>
         </w:rPr>
         <w:t>The Sendai Report</w:t>
       </w:r>
       <w:r>
+        <w:rPr/>
         <w:t xml:space="preserve"> (Ghesquiere et al. 2012) and is aligned with the Sendai Framework for Disaster Risk Reduction.</w:t>
       </w:r>
       <w:r>
@@ -5088,21 +3516,21 @@
       </w:r>
       <w:r>
         <w:rPr>
-          <w:rFonts w:eastAsiaTheme="minorEastAsia"/>
+          <w:rFonts w:eastAsia="游ゴシック" w:eastAsiaTheme="minorEastAsia"/>
         </w:rPr>
         <w:t xml:space="preserve">It is also used in the </w:t>
       </w:r>
       <w:r>
         <w:rPr>
-          <w:rFonts w:eastAsiaTheme="minorEastAsia"/>
-          <w:i/>
-          <w:iCs/>
+          <w:rFonts w:eastAsia="游ゴシック" w:eastAsiaTheme="minorEastAsia"/>
+          <w:i w:val="1"/>
+          <w:iCs w:val="1"/>
         </w:rPr>
         <w:t xml:space="preserve">Driving Policy Reform for Disaster Resilience </w:t>
       </w:r>
       <w:r>
         <w:rPr>
-          <w:rFonts w:eastAsiaTheme="minorEastAsia"/>
+          <w:rFonts w:eastAsia="游ゴシック" w:eastAsiaTheme="minorEastAsia"/>
         </w:rPr>
         <w:t>report (World Bank 2025).</w:t>
       </w:r>
@@ -5112,6 +3540,7 @@
     <w:p>
       <w:pPr>
         <w:pStyle w:val="FootnoteText"/>
+        <w:spacing w:line="240" w:lineRule="auto"/>
         <w:jc w:val="both"/>
       </w:pPr>
       <w:r>
@@ -5140,22 +3569,9 @@
         <w:rPr/>
         <w:t>n “Unknown” option is also available and is treated as a negative response.</w:t>
       </w:r>
-    </w:p>
-  </w:footnote>
-  <w:footnote w:id="5">
-    <w:p>
-      <w:pPr>
-        <w:pStyle w:val="FootnoteText"/>
-        <w:jc w:val="both"/>
-      </w:pPr>
-      <w:r>
-        <w:rPr>
-          <w:rStyle w:val="FootnoteReference"/>
-        </w:rPr>
-        <w:footnoteRef/>
-      </w:r>
-      <w:r>
-        <w:t xml:space="preserve"> Essential government entities refer to the main ministry or agency in charge of the followings eight sectors: Agriculture, Education, Housing, Health, Energy, Tourism, Transport, Water and Sanitation.</w:t>
+      <w:r>
+        <w:rPr/>
+        <w:t xml:space="preserve"> The latest version of the questionnaire can be downloaded from the website.</w:t>
       </w:r>
     </w:p>
   </w:footnote>
@@ -5176,11 +3592,12 @@
     </w:tblGrid>
     <w:tr>
       <w:trPr>
-        <w:trHeight w:val="300"/>
+        <w:trHeight w:val="1005"/>
       </w:trPr>
       <w:tc>
         <w:tcPr>
           <w:tcW w:w="3005" w:type="dxa"/>
+          <w:tcMar/>
         </w:tcPr>
         <w:p>
           <w:pPr>
@@ -5188,26 +3605,23 @@
             <w:ind w:left="-115"/>
           </w:pPr>
           <w:r>
-            <w:rPr>
-              <w:noProof/>
-            </w:rPr>
             <w:drawing>
-              <wp:inline distT="0" distB="0" distL="0" distR="0" wp14:anchorId="2A193C5A" wp14:editId="161A62F1">
-                <wp:extent cx="1771650" cy="501132"/>
+              <wp:inline wp14:editId="6E992409" wp14:anchorId="2A193C5A">
+                <wp:extent cx="1755521" cy="496570"/>
                 <wp:effectExtent l="0" t="0" r="0" b="0"/>
                 <wp:docPr id="74262282" name="drawing"/>
                 <wp:cNvGraphicFramePr>
-                  <a:graphicFrameLocks xmlns:a="http://schemas.openxmlformats.org/drawingml/2006/main" noChangeAspect="1"/>
+                  <a:graphicFrameLocks noChangeAspect="1"/>
                 </wp:cNvGraphicFramePr>
-                <a:graphic xmlns:a="http://schemas.openxmlformats.org/drawingml/2006/main">
-                  <a:graphicData uri="http://schemas.openxmlformats.org/drawingml/2006/picture">
+                <a:graphic>
+                  <a:graphicData xmlns:a="http://schemas.openxmlformats.org/drawingml/2006/main" uri="http://schemas.openxmlformats.org/drawingml/2006/picture">
                     <pic:pic xmlns:pic="http://schemas.openxmlformats.org/drawingml/2006/picture">
                       <pic:nvPicPr>
                         <pic:cNvPr id="689585868" name=""/>
                         <pic:cNvPicPr/>
                       </pic:nvPicPr>
                       <pic:blipFill>
-                        <a:blip r:embed="rId1">
+                        <a:blip xmlns:r="http://schemas.openxmlformats.org/officeDocument/2006/relationships" r:embed="rId1">
                           <a:extLst>
                             <a:ext uri="{28A0092B-C50C-407E-A947-70E740481C1C}">
                               <a14:useLocalDpi xmlns:a14="http://schemas.microsoft.com/office/drawing/2010/main"/>
@@ -5219,9 +3633,9 @@
                         </a:stretch>
                       </pic:blipFill>
                       <pic:spPr>
-                        <a:xfrm>
+                        <a:xfrm rot="0">
                           <a:off x="0" y="0"/>
-                          <a:ext cx="1771650" cy="501132"/>
+                          <a:ext cx="1755521" cy="496570"/>
                         </a:xfrm>
                         <a:prstGeom prst="rect">
                           <a:avLst/>
@@ -5238,6 +3652,7 @@
       <w:tc>
         <w:tcPr>
           <w:tcW w:w="3005" w:type="dxa"/>
+          <w:tcMar/>
         </w:tcPr>
         <w:p>
           <w:pPr>
@@ -5249,6 +3664,7 @@
       <w:tc>
         <w:tcPr>
           <w:tcW w:w="3005" w:type="dxa"/>
+          <w:tcMar/>
         </w:tcPr>
         <w:p>
           <w:pPr>

</xml_diff>